<commit_message>
Manual e informe: redacción más clara; el informe suma la definición y justificación del problema y la tabla de variables
Se explican con palabras sencillas los términos técnicos (vigilancia,
prototipo, capas F1/F2, percentil 90, AND, pureza) sin cambiar
resultados ni estructura.

Co-Authored-By: Claude Opus 5.5 <noreply@anthropic.com>
</commit_message>
<xml_diff>
--- a/docs/Informe_de_Corridas_CarGross.docx
+++ b/docs/Informe_de_Corridas_CarGross.docx
@@ -352,7 +352,7 @@
         <w:jc w:val="both"/>
       </w:pPr>
       <w:r>
-        <w:t xml:space="preserve">Este informe presenta las corridas de </w:t>
+        <w:t xml:space="preserve">Este informe presenta las ejecuciones (corridas) de </w:t>
       </w:r>
       <w:r>
         <w:rPr>
@@ -362,32 +362,7 @@
         <w:t xml:space="preserve">CarGross.py</w:t>
       </w:r>
       <w:r>
-        <w:t xml:space="preserve"> con los dos datasets entregados y evalúa sus resultados. Se busca responder tres preguntas: (1) si la red descubre estados operativos coherentes del servidor sin etiquetas; (2) cómo influyen la vigilancia ρ y el orden de presentación en el agrupamiento; y (3) si la red reconoce como nuevo un régimen de estrés cuando ya aprendió el régimen nominal, que es la definición operativa de anomalía planteada en la propuesta.</w:t>
-      </w:r>
-    </w:p>
-    <w:p>
-      <w:pPr>
-        <w:pStyle w:val="Heading1"/>
-      </w:pPr>
-      <w:r>
-        <w:t xml:space="preserve">2. La red y su implementación</w:t>
-      </w:r>
-    </w:p>
-    <w:p>
-      <w:pPr>
-        <w:pStyle w:val="Heading2"/>
-      </w:pPr>
-      <w:r>
-        <w:t xml:space="preserve">2.1 Algoritmo</w:t>
-      </w:r>
-    </w:p>
-    <w:p>
-      <w:pPr>
-        <w:spacing w:after="120" w:line="288"/>
-        <w:jc w:val="both"/>
-      </w:pPr>
-      <w:r>
-        <w:t xml:space="preserve">La implementación sigue el algoritmo del Box 3 de Lippmann (1987). Para cada patrón binario X de N componentes:</w:t>
+        <w:t xml:space="preserve"> con los dos datasets entregados y evalúa sus resultados. Busca responder tres preguntas:</w:t>
       </w:r>
     </w:p>
     <w:p>
@@ -400,14 +375,7 @@
         <w:spacing w:after="60" w:line="276"/>
       </w:pPr>
       <w:r>
-        <w:rPr>
-          <w:b/>
-          <w:bCs/>
-        </w:rPr>
-        <w:t xml:space="preserve">Inicialización:</w:t>
-      </w:r>
-      <w:r>
-        <w:t xml:space="preserve"> cada nodo de salida j arranca libre, con pesos descendentes t_ij = 1 y ascendentes b_ij = 1/(1+N).</w:t>
+        <w:t xml:space="preserve">¿La red descubre, sin que se le indiquen etiquetas, estados de funcionamiento del servidor que tengan sentido?</w:t>
       </w:r>
     </w:p>
     <w:p>
@@ -420,14 +388,7 @@
         <w:spacing w:after="60" w:line="276"/>
       </w:pPr>
       <w:r>
-        <w:rPr>
-          <w:b/>
-          <w:bCs/>
-        </w:rPr>
-        <w:t xml:space="preserve">Puntaje de coincidencia:</w:t>
-      </w:r>
-      <w:r>
-        <w:t xml:space="preserve"> μ_j = Σ b_ij · x_i para todos los nodos, comprometidos o libres.</w:t>
+        <w:t xml:space="preserve">¿Cómo influyen en el agrupamiento la vigilancia ρ y el orden en que se presentan los datos?</w:t>
       </w:r>
     </w:p>
     <w:p>
@@ -440,74 +401,61 @@
         <w:spacing w:after="60" w:line="276"/>
       </w:pPr>
       <w:r>
+        <w:t xml:space="preserve">Si la red ya aprendió el funcionamiento normal, ¿reconoce como nuevo un período de estrés? Esta es la definición de anomalía que se planteó en la propuesta.</w:t>
+      </w:r>
+    </w:p>
+    <w:p>
+      <w:pPr>
+        <w:pStyle w:val="Heading1"/>
+      </w:pPr>
+      <w:r>
+        <w:t xml:space="preserve">2. Definición y justificación del problema</w:t>
+      </w:r>
+    </w:p>
+    <w:p>
+      <w:pPr>
+        <w:pStyle w:val="Heading2"/>
+      </w:pPr>
+      <w:r>
+        <w:t xml:space="preserve">2.1 Definición de la tarea</w:t>
+      </w:r>
+    </w:p>
+    <w:p>
+      <w:pPr>
+        <w:spacing w:after="120" w:line="288"/>
+        <w:jc w:val="both"/>
+      </w:pPr>
+      <w:r>
+        <w:t xml:space="preserve">El trabajo consiste en aplicar la red de Carpenter/Grossberg para agrupar, sin supervisión, los estados de funcionamiento de un servidor a partir de su telemetría, es decir, de mediciones periódicas de uso de CPU, memoria, disco y red. Que el agrupamiento sea </w:t>
+      </w:r>
+      <w:r>
         <w:rPr>
           <w:b/>
           <w:bCs/>
         </w:rPr>
-        <w:t xml:space="preserve">Ganador:</w:t>
-      </w:r>
-      <w:r>
-        <w:t xml:space="preserve"> el nodo de mayor μ_j (en la red, por inhibición lateral).</w:t>
-      </w:r>
-    </w:p>
-    <w:p>
-      <w:pPr>
-        <w:pStyle w:val="ListParagraph"/>
-        <w:numPr>
-          <w:ilvl w:val="0"/>
-          <w:numId w:val="2"/>
-        </w:numPr>
-        <w:spacing w:after="60" w:line="276"/>
-      </w:pPr>
+        <w:t xml:space="preserve">no supervisado</w:t>
+      </w:r>
+      <w:r>
+        <w:t xml:space="preserve"> significa que la red no recibe etiquetas como "normal" o "falla": forma los grupos solo a partir del parecido entre los perfiles de telemetría.</w:t>
+      </w:r>
+    </w:p>
+    <w:p>
+      <w:pPr>
+        <w:spacing w:after="120" w:line="288"/>
+        <w:jc w:val="both"/>
+      </w:pPr>
+      <w:r>
+        <w:t xml:space="preserve">Una </w:t>
+      </w:r>
       <w:r>
         <w:rPr>
           <w:b/>
           <w:bCs/>
         </w:rPr>
-        <w:t xml:space="preserve">Test de vigilancia:</w:t>
-      </w:r>
-      <w:r>
-        <w:t xml:space="preserve"> si ‖T·X‖ / ‖X‖ &gt; ρ, es decir, si la fracción de unos del patrón presente en el prototipo supera ρ, el patrón se asigna al ganador.</w:t>
-      </w:r>
-    </w:p>
-    <w:p>
-      <w:pPr>
-        <w:pStyle w:val="ListParagraph"/>
-        <w:numPr>
-          <w:ilvl w:val="0"/>
-          <w:numId w:val="2"/>
-        </w:numPr>
-        <w:spacing w:after="60" w:line="276"/>
-      </w:pPr>
-      <w:r>
-        <w:rPr>
-          <w:b/>
-          <w:bCs/>
-        </w:rPr>
-        <w:t xml:space="preserve">Adaptación:</w:t>
-      </w:r>
-      <w:r>
-        <w:t xml:space="preserve"> el prototipo se actualiza con un AND lógico (t_ij ← t_ij · x_i) y b_ij ← t_ij · x_i / (0.5 + Σ t_ij · x_i).</w:t>
-      </w:r>
-    </w:p>
-    <w:p>
-      <w:pPr>
-        <w:pStyle w:val="ListParagraph"/>
-        <w:numPr>
-          <w:ilvl w:val="0"/>
-          <w:numId w:val="2"/>
-        </w:numPr>
-        <w:spacing w:after="60" w:line="276"/>
-      </w:pPr>
-      <w:r>
-        <w:rPr>
-          <w:b/>
-          <w:bCs/>
-        </w:rPr>
-        <w:t xml:space="preserve">Reset:</w:t>
-      </w:r>
-      <w:r>
-        <w:t xml:space="preserve"> si no supera el test, el ganador se inhabilita para ese patrón y se vuelve al paso 3. Cuando gana un nodo libre, se crea una categoría nueva.</w:t>
+        <w:t xml:space="preserve">anomalía</w:t>
+      </w:r>
+      <w:r>
+        <w:t xml:space="preserve"> se define de forma operativa: es un comportamiento del servidor que la red no logra asociar a ninguno de los grupos aprendidos durante el funcionamiento normal, y que por eso la lleva a crear un grupo nuevo.</w:t>
       </w:r>
     </w:p>
     <w:p>
@@ -515,7 +463,7 @@
         <w:pStyle w:val="Heading2"/>
       </w:pPr>
       <w:r>
-        <w:t xml:space="preserve">2.2 Verificación de la implementación</w:t>
+        <w:t xml:space="preserve">2.2 Justificación de la elección de la red</w:t>
       </w:r>
     </w:p>
     <w:p>
@@ -532,10 +480,10 @@
           <w:b/>
           <w:bCs/>
         </w:rPr>
-        <w:t xml:space="preserve">Ejemplo de Lippmann (Fig. 11):</w:t>
-      </w:r>
-      <w:r>
-        <w:t xml:space="preserve"> con letras C, E y F de 5×5, ρ = 0.9 produce tres ejemplares; con una vigilancia menor, C y E se fusionan en un ejemplar idéntico a C; y una F con un píxel faltante se acepta y degrada el ejemplar F por el AND. Es el mismo comportamiento que describe el artículo.</w:t>
+        <w:t xml:space="preserve">Aprende de forma continua:</w:t>
+      </w:r>
+      <w:r>
+        <w:t xml:space="preserve"> según Lippmann (1987), la red implementa el algoritmo del líder, en el que cada dato nuevo se compara con los grupos existentes y, si no se parece a ninguno, inicia un grupo propio. Esto le permite seguir aprendiendo mientras recibe datos, algo importante en infraestructura informática, donde aparecen continuamente nuevos tipos de fallas o de carga.</w:t>
       </w:r>
     </w:p>
     <w:p>
@@ -552,10 +500,10 @@
           <w:b/>
           <w:bCs/>
         </w:rPr>
-        <w:t xml:space="preserve">Equivalencia con el Box 3 literal:</w:t>
-      </w:r>
-      <w:r>
-        <w:t xml:space="preserve"> una implementación literal del Box 3 (M nodos inicializados y compitiendo desde el principio) produce las mismas asignaciones que CarGross.py en los dos datasets y en 100 conjuntos aleatorios, para distintos ρ y M.</w:t>
+        <w:t xml:space="preserve">No hay que fijar de antemano la cantidad de grupos:</w:t>
+      </w:r>
+      <w:r>
+        <w:t xml:space="preserve"> la red crea tantas categorías como el comportamiento del servidor requiera, según la vigilancia elegida.</w:t>
       </w:r>
     </w:p>
     <w:p>
@@ -572,10 +520,10 @@
           <w:b/>
           <w:bCs/>
         </w:rPr>
-        <w:t xml:space="preserve">Corrección respecto de la versión anterior:</w:t>
-      </w:r>
-      <w:r>
-        <w:t xml:space="preserve"> la primera versión creaba los nodos solo cuando ningún nodo existente pasaba el test, sin dejar competir a los nodos libres. Con el dataset de estrés y ρ = 0.3 eso producía 27/73 en lugar de los 21/79 del Box 3. La versión actual corrige esa diferencia.</w:t>
+        <w:t xml:space="preserve">No supone una distribución estadística:</w:t>
+      </w:r>
+      <w:r>
+        <w:t xml:space="preserve"> no parte de suposiciones sobre la forma de los datos de telemetría; solo compara patrones de 0 y 1.</w:t>
       </w:r>
     </w:p>
     <w:p>
@@ -588,7 +536,299 @@
         <w:spacing w:after="60" w:line="276"/>
       </w:pPr>
       <w:r>
-        <w:t xml:space="preserve">El conjunto completo (16 pruebas automáticas) se ejecuta con </w:t>
+        <w:rPr>
+          <w:b/>
+          <w:bCs/>
+        </w:rPr>
+        <w:t xml:space="preserve">Lo nuevo no borra lo aprendido:</w:t>
+      </w:r>
+      <w:r>
+        <w:t xml:space="preserve"> la red solo modifica un grupo cuando el dato nuevo se le parece lo suficiente. Un comportamiento distinto genera un grupo nuevo en lugar de alterar los existentes.</w:t>
+      </w:r>
+    </w:p>
+    <w:p>
+      <w:pPr>
+        <w:pStyle w:val="ListParagraph"/>
+        <w:numPr>
+          <w:ilvl w:val="0"/>
+          <w:numId w:val="3"/>
+        </w:numPr>
+        <w:spacing w:after="60" w:line="276"/>
+      </w:pPr>
+      <w:r>
+        <w:rPr>
+          <w:b/>
+          <w:bCs/>
+        </w:rPr>
+        <w:t xml:space="preserve">La binarización actúa como primer filtro:</w:t>
+      </w:r>
+      <w:r>
+        <w:t xml:space="preserve"> como la red trabaja con 0 y 1, cada métrica se convierte en una alerta que vale 1 solo cuando la medición es alta. Así se dejan de lado las variaciones menores y se conservan los estados críticos.</w:t>
+      </w:r>
+    </w:p>
+    <w:p>
+      <w:pPr>
+        <w:pStyle w:val="Heading1"/>
+      </w:pPr>
+      <w:r>
+        <w:t xml:space="preserve">3. La red y su implementación</w:t>
+      </w:r>
+    </w:p>
+    <w:p>
+      <w:pPr>
+        <w:pStyle w:val="Heading2"/>
+      </w:pPr>
+      <w:r>
+        <w:t xml:space="preserve">3.1 Algoritmo</w:t>
+      </w:r>
+    </w:p>
+    <w:p>
+      <w:pPr>
+        <w:spacing w:after="120" w:line="288"/>
+        <w:jc w:val="both"/>
+      </w:pPr>
+      <w:r>
+        <w:t xml:space="preserve">La red tiene dos capas de neuronas: la capa de entrada, llamada </w:t>
+      </w:r>
+      <w:r>
+        <w:rPr>
+          <w:b/>
+          <w:bCs/>
+        </w:rPr>
+        <w:t xml:space="preserve">F1</w:t>
+      </w:r>
+      <w:r>
+        <w:t xml:space="preserve">, con una neurona por variable, y la capa de salida, llamada </w:t>
+      </w:r>
+      <w:r>
+        <w:rPr>
+          <w:b/>
+          <w:bCs/>
+        </w:rPr>
+        <w:t xml:space="preserve">F2</w:t>
+      </w:r>
+      <w:r>
+        <w:t xml:space="preserve">, con una neurona por grupo o categoría. Cada grupo se representa con un </w:t>
+      </w:r>
+      <w:r>
+        <w:rPr>
+          <w:b/>
+          <w:bCs/>
+        </w:rPr>
+        <w:t xml:space="preserve">prototipo</w:t>
+      </w:r>
+      <w:r>
+        <w:t xml:space="preserve">: un patrón de 0 y 1 que resume a los registros del grupo y que se guarda en los pesos que van de F2 a F1 (pesos descendentes o *top-down*, t). Los pesos que van de F1 a F2 (pesos ascendentes o *bottom-up*, b) sirven para elegir qué grupo compite primero.</w:t>
+      </w:r>
+    </w:p>
+    <w:p>
+      <w:pPr>
+        <w:spacing w:after="120" w:line="288"/>
+        <w:jc w:val="both"/>
+      </w:pPr>
+      <w:r>
+        <w:t xml:space="preserve">La implementación sigue el algoritmo del Box 3 de Lippmann (1987). Para cada registro X de N valores:</w:t>
+      </w:r>
+    </w:p>
+    <w:p>
+      <w:pPr>
+        <w:pStyle w:val="ListParagraph"/>
+        <w:numPr>
+          <w:ilvl w:val="0"/>
+          <w:numId w:val="4"/>
+        </w:numPr>
+        <w:spacing w:after="60" w:line="276"/>
+      </w:pPr>
+      <w:r>
+        <w:rPr>
+          <w:b/>
+          <w:bCs/>
+        </w:rPr>
+        <w:t xml:space="preserve">Inicialización:</w:t>
+      </w:r>
+      <w:r>
+        <w:t xml:space="preserve"> todas las neuronas de salida empiezan libres, con pesos t = 1 y b = 1/(1+N).</w:t>
+      </w:r>
+    </w:p>
+    <w:p>
+      <w:pPr>
+        <w:pStyle w:val="ListParagraph"/>
+        <w:numPr>
+          <w:ilvl w:val="0"/>
+          <w:numId w:val="4"/>
+        </w:numPr>
+        <w:spacing w:after="60" w:line="276"/>
+      </w:pPr>
+      <w:r>
+        <w:rPr>
+          <w:b/>
+          <w:bCs/>
+        </w:rPr>
+        <w:t xml:space="preserve">Puntaje de coincidencia:</w:t>
+      </w:r>
+      <w:r>
+        <w:t xml:space="preserve"> cada neurona de salida calcula μ_j = Σ b_ij · x_i, es decir, la suma de sus pesos ascendentes en las posiciones donde el registro tiene un 1.</w:t>
+      </w:r>
+    </w:p>
+    <w:p>
+      <w:pPr>
+        <w:pStyle w:val="ListParagraph"/>
+        <w:numPr>
+          <w:ilvl w:val="0"/>
+          <w:numId w:val="4"/>
+        </w:numPr>
+        <w:spacing w:after="60" w:line="276"/>
+      </w:pPr>
+      <w:r>
+        <w:rPr>
+          <w:b/>
+          <w:bCs/>
+        </w:rPr>
+        <w:t xml:space="preserve">Elección de la ganadora:</w:t>
+      </w:r>
+      <w:r>
+        <w:t xml:space="preserve"> gana la neurona con mayor puntaje. En la red real esto ocurre por inhibición lateral: las neuronas de F2 compiten y se apagan entre sí hasta que queda una sola activa.</w:t>
+      </w:r>
+    </w:p>
+    <w:p>
+      <w:pPr>
+        <w:pStyle w:val="ListParagraph"/>
+        <w:numPr>
+          <w:ilvl w:val="0"/>
+          <w:numId w:val="4"/>
+        </w:numPr>
+        <w:spacing w:after="60" w:line="276"/>
+      </w:pPr>
+      <w:r>
+        <w:rPr>
+          <w:b/>
+          <w:bCs/>
+        </w:rPr>
+        <w:t xml:space="preserve">Test de vigilancia:</w:t>
+      </w:r>
+      <w:r>
+        <w:t xml:space="preserve"> se calcula ‖T·X‖ / ‖X‖, que es la cantidad de unos del registro que también están en el prototipo de la ganadora, dividida por la cantidad total de unos del registro. Si ese valor supera ρ, el registro se asigna a la ganadora.</w:t>
+      </w:r>
+    </w:p>
+    <w:p>
+      <w:pPr>
+        <w:pStyle w:val="ListParagraph"/>
+        <w:numPr>
+          <w:ilvl w:val="0"/>
+          <w:numId w:val="4"/>
+        </w:numPr>
+        <w:spacing w:after="60" w:line="276"/>
+      </w:pPr>
+      <w:r>
+        <w:rPr>
+          <w:b/>
+          <w:bCs/>
+        </w:rPr>
+        <w:t xml:space="preserve">Aprendizaje:</w:t>
+      </w:r>
+      <w:r>
+        <w:t xml:space="preserve"> el prototipo se actualiza con un AND lógico (t_ij ← t_ij · x_i): conserva un 1 solo donde el prototipo y el registro tienen 1. Los pesos ascendentes se recalculan como b_ij = t_ij · x_i / (0.5 + Σ t_ij · x_i).</w:t>
+      </w:r>
+    </w:p>
+    <w:p>
+      <w:pPr>
+        <w:pStyle w:val="ListParagraph"/>
+        <w:numPr>
+          <w:ilvl w:val="0"/>
+          <w:numId w:val="4"/>
+        </w:numPr>
+        <w:spacing w:after="60" w:line="276"/>
+      </w:pPr>
+      <w:r>
+        <w:rPr>
+          <w:b/>
+          <w:bCs/>
+        </w:rPr>
+        <w:t xml:space="preserve">Reset:</w:t>
+      </w:r>
+      <w:r>
+        <w:t xml:space="preserve"> si no se supera el test, la ganadora queda descartada para ese registro y se vuelve al paso 3 con las restantes. Cuando gana una neurona libre, se crea un grupo nuevo.</w:t>
+      </w:r>
+    </w:p>
+    <w:p>
+      <w:pPr>
+        <w:pStyle w:val="Heading2"/>
+      </w:pPr>
+      <w:r>
+        <w:t xml:space="preserve">3.2 Verificación de la implementación</w:t>
+      </w:r>
+    </w:p>
+    <w:p>
+      <w:pPr>
+        <w:pStyle w:val="ListParagraph"/>
+        <w:numPr>
+          <w:ilvl w:val="0"/>
+          <w:numId w:val="3"/>
+        </w:numPr>
+        <w:spacing w:after="60" w:line="276"/>
+      </w:pPr>
+      <w:r>
+        <w:rPr>
+          <w:b/>
+          <w:bCs/>
+        </w:rPr>
+        <w:t xml:space="preserve">Ejemplo de Lippmann (Fig. 11):</w:t>
+      </w:r>
+      <w:r>
+        <w:t xml:space="preserve"> se reprodujo con letras C, E y F dibujadas en grillas de 5 × 5. Con ρ = 0.9 la red crea un grupo por letra. Con una vigilancia menor, C y E quedan en el mismo grupo y su prototipo resulta igual a la C. Una F a la que le falta un píxel se acepta como F y, por el AND, borra ese píxel del prototipo. Es el mismo comportamiento que describe el artículo.</w:t>
+      </w:r>
+    </w:p>
+    <w:p>
+      <w:pPr>
+        <w:pStyle w:val="ListParagraph"/>
+        <w:numPr>
+          <w:ilvl w:val="0"/>
+          <w:numId w:val="3"/>
+        </w:numPr>
+        <w:spacing w:after="60" w:line="276"/>
+      </w:pPr>
+      <w:r>
+        <w:rPr>
+          <w:b/>
+          <w:bCs/>
+        </w:rPr>
+        <w:t xml:space="preserve">Comparación con el Box 3 tal cual está escrito:</w:t>
+      </w:r>
+      <w:r>
+        <w:t xml:space="preserve"> se programó también una versión literal del Box 3, con todas las neuronas inicializadas y compitiendo desde el principio. Produce exactamente las mismas asignaciones que CarGross.py en los dos datasets y en 100 conjuntos de datos generados al azar, con distintos valores de ρ y de cantidad de neuronas.</w:t>
+      </w:r>
+    </w:p>
+    <w:p>
+      <w:pPr>
+        <w:pStyle w:val="ListParagraph"/>
+        <w:numPr>
+          <w:ilvl w:val="0"/>
+          <w:numId w:val="3"/>
+        </w:numPr>
+        <w:spacing w:after="60" w:line="276"/>
+      </w:pPr>
+      <w:r>
+        <w:rPr>
+          <w:b/>
+          <w:bCs/>
+        </w:rPr>
+        <w:t xml:space="preserve">Corrección respecto de la versión anterior:</w:t>
+      </w:r>
+      <w:r>
+        <w:t xml:space="preserve"> la primera versión del programa solo creaba un grupo nuevo cuando ningún grupo existente pasaba el test, sin dejar que las neuronas libres compitieran desde el inicio como indica el Box 3. Con el dataset de estrés y ρ = 0.3, eso producía grupos de 27 y 73 registros en lugar de los 21 y 79 que da el Box 3. La versión actual corrige esa diferencia.</w:t>
+      </w:r>
+    </w:p>
+    <w:p>
+      <w:pPr>
+        <w:pStyle w:val="ListParagraph"/>
+        <w:numPr>
+          <w:ilvl w:val="0"/>
+          <w:numId w:val="3"/>
+        </w:numPr>
+        <w:spacing w:after="60" w:line="276"/>
+      </w:pPr>
+      <w:r>
+        <w:t xml:space="preserve">Las 16 pruebas automáticas se ejecutan con </w:t>
       </w:r>
       <w:r>
         <w:rPr>
@@ -607,7 +847,7 @@
         <w:pStyle w:val="Heading1"/>
       </w:pPr>
       <w:r>
-        <w:t xml:space="preserve">3. Datos</w:t>
+        <w:t xml:space="preserve">4. Datos</w:t>
       </w:r>
     </w:p>
     <w:p>
@@ -616,7 +856,7 @@
         <w:jc w:val="both"/>
       </w:pPr>
       <w:r>
-        <w:t xml:space="preserve">La fuente es la telemetría de un servidor: 2243 registros tomados cada 300 segundos durante 8 días, con 5 métricas continuas (CPU, memoria, E/S de disco, red entrante y red saliente). </w:t>
+        <w:t xml:space="preserve">Los datos provienen de la telemetría de un servidor: 2243 registros tomados cada 300 segundos (5 minutos) durante 8 días, con 5 mediciones continuas: CPU, memoria, uso de disco, tráfico de red entrante y tráfico de red saliente. El script </w:t>
       </w:r>
       <w:r>
         <w:rPr>
@@ -627,7 +867,778 @@
         <w:t xml:space="preserve">preprocesamiento_art1.py</w:t>
       </w:r>
       <w:r>
-        <w:t xml:space="preserve"> binariza cada métrica con su percentil 90 en todo el período: la variable vale 1 cuando la métrica está en el 10 % más alto (umbrales en </w:t>
+        <w:t xml:space="preserve"> convierte cada medición en una variable de 0 y 1 usando su </w:t>
+      </w:r>
+      <w:r>
+        <w:rPr>
+          <w:b/>
+          <w:bCs/>
+        </w:rPr>
+        <w:t xml:space="preserve">percentil 90</w:t>
+      </w:r>
+      <w:r>
+        <w:t xml:space="preserve">, que es el valor que solo supera el 10 % más alto de las mediciones del período. La variable vale 1 cuando la medición está por encima de ese valor:</w:t>
+      </w:r>
+    </w:p>
+    <w:tbl>
+      <w:tblPr>
+        <w:tblW w:type="dxa" w:w="9026"/>
+        <w:tblBorders>
+          <w:top w:val="single" w:color="auto" w:sz="4"/>
+          <w:left w:val="single" w:color="auto" w:sz="4"/>
+          <w:bottom w:val="single" w:color="auto" w:sz="4"/>
+          <w:right w:val="single" w:color="auto" w:sz="4"/>
+          <w:insideH w:val="single" w:color="auto" w:sz="4"/>
+          <w:insideV w:val="single" w:color="auto" w:sz="4"/>
+        </w:tblBorders>
+      </w:tblPr>
+      <w:tblGrid>
+        <w:gridCol w:w="1900"/>
+        <w:gridCol w:w="2300"/>
+        <w:gridCol w:w="1400"/>
+        <w:gridCol w:w="3426"/>
+      </w:tblGrid>
+      <w:tr>
+        <w:trPr>
+          <w:tblHeader/>
+        </w:trPr>
+        <w:tc>
+          <w:tcPr>
+            <w:tcW w:type="dxa" w:w="1900"/>
+            <w:tcBorders>
+              <w:top w:val="single" w:color="B7C4D1" w:sz="4"/>
+              <w:left w:val="single" w:color="B7C4D1" w:sz="4"/>
+              <w:bottom w:val="single" w:color="B7C4D1" w:sz="4"/>
+              <w:right w:val="single" w:color="B7C4D1" w:sz="4"/>
+            </w:tcBorders>
+            <w:shd w:fill="DCE6F0" w:color="auto" w:val="clear"/>
+            <w:tcMar>
+              <w:top w:type="dxa" w:w="60"/>
+              <w:left w:type="dxa" w:w="100"/>
+              <w:bottom w:type="dxa" w:w="60"/>
+              <w:right w:type="dxa" w:w="100"/>
+            </w:tcMar>
+          </w:tcPr>
+          <w:p>
+            <w:pPr>
+              <w:spacing w:after="0"/>
+            </w:pPr>
+            <w:r>
+              <w:rPr>
+                <w:b/>
+                <w:bCs/>
+                <w:sz w:val="19"/>
+                <w:szCs w:val="19"/>
+              </w:rPr>
+              <w:t xml:space="preserve">Variable</w:t>
+            </w:r>
+          </w:p>
+        </w:tc>
+        <w:tc>
+          <w:tcPr>
+            <w:tcW w:type="dxa" w:w="2300"/>
+            <w:tcBorders>
+              <w:top w:val="single" w:color="B7C4D1" w:sz="4"/>
+              <w:left w:val="single" w:color="B7C4D1" w:sz="4"/>
+              <w:bottom w:val="single" w:color="B7C4D1" w:sz="4"/>
+              <w:right w:val="single" w:color="B7C4D1" w:sz="4"/>
+            </w:tcBorders>
+            <w:shd w:fill="DCE6F0" w:color="auto" w:val="clear"/>
+            <w:tcMar>
+              <w:top w:type="dxa" w:w="60"/>
+              <w:left w:type="dxa" w:w="100"/>
+              <w:bottom w:type="dxa" w:w="60"/>
+              <w:right w:type="dxa" w:w="100"/>
+            </w:tcMar>
+          </w:tcPr>
+          <w:p>
+            <w:pPr>
+              <w:spacing w:after="0"/>
+            </w:pPr>
+            <w:r>
+              <w:rPr>
+                <w:b/>
+                <w:bCs/>
+                <w:sz w:val="19"/>
+                <w:szCs w:val="19"/>
+              </w:rPr>
+              <w:t xml:space="preserve">Medición original</w:t>
+            </w:r>
+          </w:p>
+        </w:tc>
+        <w:tc>
+          <w:tcPr>
+            <w:tcW w:type="dxa" w:w="1400"/>
+            <w:tcBorders>
+              <w:top w:val="single" w:color="B7C4D1" w:sz="4"/>
+              <w:left w:val="single" w:color="B7C4D1" w:sz="4"/>
+              <w:bottom w:val="single" w:color="B7C4D1" w:sz="4"/>
+              <w:right w:val="single" w:color="B7C4D1" w:sz="4"/>
+            </w:tcBorders>
+            <w:shd w:fill="DCE6F0" w:color="auto" w:val="clear"/>
+            <w:tcMar>
+              <w:top w:type="dxa" w:w="60"/>
+              <w:left w:type="dxa" w:w="100"/>
+              <w:bottom w:type="dxa" w:w="60"/>
+              <w:right w:type="dxa" w:w="100"/>
+            </w:tcMar>
+          </w:tcPr>
+          <w:p>
+            <w:pPr>
+              <w:spacing w:after="0"/>
+            </w:pPr>
+            <w:r>
+              <w:rPr>
+                <w:b/>
+                <w:bCs/>
+                <w:sz w:val="19"/>
+                <w:szCs w:val="19"/>
+              </w:rPr>
+              <w:t xml:space="preserve">Umbral (P90)</w:t>
+            </w:r>
+          </w:p>
+        </w:tc>
+        <w:tc>
+          <w:tcPr>
+            <w:tcW w:type="dxa" w:w="3426"/>
+            <w:tcBorders>
+              <w:top w:val="single" w:color="B7C4D1" w:sz="4"/>
+              <w:left w:val="single" w:color="B7C4D1" w:sz="4"/>
+              <w:bottom w:val="single" w:color="B7C4D1" w:sz="4"/>
+              <w:right w:val="single" w:color="B7C4D1" w:sz="4"/>
+            </w:tcBorders>
+            <w:shd w:fill="DCE6F0" w:color="auto" w:val="clear"/>
+            <w:tcMar>
+              <w:top w:type="dxa" w:w="60"/>
+              <w:left w:type="dxa" w:w="100"/>
+              <w:bottom w:type="dxa" w:w="60"/>
+              <w:right w:type="dxa" w:w="100"/>
+            </w:tcMar>
+          </w:tcPr>
+          <w:p>
+            <w:pPr>
+              <w:spacing w:after="0"/>
+            </w:pPr>
+            <w:r>
+              <w:rPr>
+                <w:b/>
+                <w:bCs/>
+                <w:sz w:val="19"/>
+                <w:szCs w:val="19"/>
+              </w:rPr>
+              <w:t xml:space="preserve">Significado cuando vale 1</w:t>
+            </w:r>
+          </w:p>
+        </w:tc>
+      </w:tr>
+      <w:tr>
+        <w:tc>
+          <w:tcPr>
+            <w:tcW w:type="dxa" w:w="1900"/>
+            <w:tcBorders>
+              <w:top w:val="single" w:color="B7C4D1" w:sz="4"/>
+              <w:left w:val="single" w:color="B7C4D1" w:sz="4"/>
+              <w:bottom w:val="single" w:color="B7C4D1" w:sz="4"/>
+              <w:right w:val="single" w:color="B7C4D1" w:sz="4"/>
+            </w:tcBorders>
+            <w:tcMar>
+              <w:top w:type="dxa" w:w="60"/>
+              <w:left w:type="dxa" w:w="100"/>
+              <w:bottom w:type="dxa" w:w="60"/>
+              <w:right w:type="dxa" w:w="100"/>
+            </w:tcMar>
+          </w:tcPr>
+          <w:p>
+            <w:pPr>
+              <w:spacing w:after="0"/>
+            </w:pPr>
+            <w:r>
+              <w:rPr>
+                <w:rFonts w:ascii="Courier New" w:cs="Courier New" w:eastAsia="Courier New" w:hAnsi="Courier New"/>
+                <w:sz w:val="19"/>
+                <w:szCs w:val="19"/>
+              </w:rPr>
+              <w:t xml:space="preserve">cpu_alta</w:t>
+            </w:r>
+          </w:p>
+        </w:tc>
+        <w:tc>
+          <w:tcPr>
+            <w:tcW w:type="dxa" w:w="2300"/>
+            <w:tcBorders>
+              <w:top w:val="single" w:color="B7C4D1" w:sz="4"/>
+              <w:left w:val="single" w:color="B7C4D1" w:sz="4"/>
+              <w:bottom w:val="single" w:color="B7C4D1" w:sz="4"/>
+              <w:right w:val="single" w:color="B7C4D1" w:sz="4"/>
+            </w:tcBorders>
+            <w:tcMar>
+              <w:top w:type="dxa" w:w="60"/>
+              <w:left w:type="dxa" w:w="100"/>
+              <w:bottom w:type="dxa" w:w="60"/>
+              <w:right w:type="dxa" w:w="100"/>
+            </w:tcMar>
+          </w:tcPr>
+          <w:p>
+            <w:pPr>
+              <w:spacing w:after="0"/>
+            </w:pPr>
+            <w:r>
+              <w:rPr>
+                <w:rFonts w:ascii="Courier New" w:cs="Courier New" w:eastAsia="Courier New" w:hAnsi="Courier New"/>
+                <w:sz w:val="19"/>
+                <w:szCs w:val="19"/>
+              </w:rPr>
+              <w:t xml:space="preserve">cpu_util_percent</w:t>
+            </w:r>
+          </w:p>
+        </w:tc>
+        <w:tc>
+          <w:tcPr>
+            <w:tcW w:type="dxa" w:w="1400"/>
+            <w:tcBorders>
+              <w:top w:val="single" w:color="B7C4D1" w:sz="4"/>
+              <w:left w:val="single" w:color="B7C4D1" w:sz="4"/>
+              <w:bottom w:val="single" w:color="B7C4D1" w:sz="4"/>
+              <w:right w:val="single" w:color="B7C4D1" w:sz="4"/>
+            </w:tcBorders>
+            <w:tcMar>
+              <w:top w:type="dxa" w:w="60"/>
+              <w:left w:type="dxa" w:w="100"/>
+              <w:bottom w:type="dxa" w:w="60"/>
+              <w:right w:type="dxa" w:w="100"/>
+            </w:tcMar>
+          </w:tcPr>
+          <w:p>
+            <w:pPr>
+              <w:spacing w:after="0"/>
+            </w:pPr>
+            <w:r>
+              <w:rPr>
+                <w:sz w:val="19"/>
+                <w:szCs w:val="19"/>
+              </w:rPr>
+              <w:t xml:space="preserve">53.51</w:t>
+            </w:r>
+          </w:p>
+        </w:tc>
+        <w:tc>
+          <w:tcPr>
+            <w:tcW w:type="dxa" w:w="3426"/>
+            <w:tcBorders>
+              <w:top w:val="single" w:color="B7C4D1" w:sz="4"/>
+              <w:left w:val="single" w:color="B7C4D1" w:sz="4"/>
+              <w:bottom w:val="single" w:color="B7C4D1" w:sz="4"/>
+              <w:right w:val="single" w:color="B7C4D1" w:sz="4"/>
+            </w:tcBorders>
+            <w:tcMar>
+              <w:top w:type="dxa" w:w="60"/>
+              <w:left w:type="dxa" w:w="100"/>
+              <w:bottom w:type="dxa" w:w="60"/>
+              <w:right w:type="dxa" w:w="100"/>
+            </w:tcMar>
+          </w:tcPr>
+          <w:p>
+            <w:pPr>
+              <w:spacing w:after="0"/>
+            </w:pPr>
+            <w:r>
+              <w:rPr>
+                <w:sz w:val="19"/>
+                <w:szCs w:val="19"/>
+              </w:rPr>
+              <w:t xml:space="preserve">Uso de CPU alto</w:t>
+            </w:r>
+          </w:p>
+        </w:tc>
+      </w:tr>
+      <w:tr>
+        <w:tc>
+          <w:tcPr>
+            <w:tcW w:type="dxa" w:w="1900"/>
+            <w:tcBorders>
+              <w:top w:val="single" w:color="B7C4D1" w:sz="4"/>
+              <w:left w:val="single" w:color="B7C4D1" w:sz="4"/>
+              <w:bottom w:val="single" w:color="B7C4D1" w:sz="4"/>
+              <w:right w:val="single" w:color="B7C4D1" w:sz="4"/>
+            </w:tcBorders>
+            <w:tcMar>
+              <w:top w:type="dxa" w:w="60"/>
+              <w:left w:type="dxa" w:w="100"/>
+              <w:bottom w:type="dxa" w:w="60"/>
+              <w:right w:type="dxa" w:w="100"/>
+            </w:tcMar>
+          </w:tcPr>
+          <w:p>
+            <w:pPr>
+              <w:spacing w:after="0"/>
+            </w:pPr>
+            <w:r>
+              <w:rPr>
+                <w:rFonts w:ascii="Courier New" w:cs="Courier New" w:eastAsia="Courier New" w:hAnsi="Courier New"/>
+                <w:sz w:val="19"/>
+                <w:szCs w:val="19"/>
+              </w:rPr>
+              <w:t xml:space="preserve">ram_alta</w:t>
+            </w:r>
+          </w:p>
+        </w:tc>
+        <w:tc>
+          <w:tcPr>
+            <w:tcW w:type="dxa" w:w="2300"/>
+            <w:tcBorders>
+              <w:top w:val="single" w:color="B7C4D1" w:sz="4"/>
+              <w:left w:val="single" w:color="B7C4D1" w:sz="4"/>
+              <w:bottom w:val="single" w:color="B7C4D1" w:sz="4"/>
+              <w:right w:val="single" w:color="B7C4D1" w:sz="4"/>
+            </w:tcBorders>
+            <w:tcMar>
+              <w:top w:type="dxa" w:w="60"/>
+              <w:left w:type="dxa" w:w="100"/>
+              <w:bottom w:type="dxa" w:w="60"/>
+              <w:right w:type="dxa" w:w="100"/>
+            </w:tcMar>
+          </w:tcPr>
+          <w:p>
+            <w:pPr>
+              <w:spacing w:after="0"/>
+            </w:pPr>
+            <w:r>
+              <w:rPr>
+                <w:rFonts w:ascii="Courier New" w:cs="Courier New" w:eastAsia="Courier New" w:hAnsi="Courier New"/>
+                <w:sz w:val="19"/>
+                <w:szCs w:val="19"/>
+              </w:rPr>
+              <w:t xml:space="preserve">mem_util_percent</w:t>
+            </w:r>
+          </w:p>
+        </w:tc>
+        <w:tc>
+          <w:tcPr>
+            <w:tcW w:type="dxa" w:w="1400"/>
+            <w:tcBorders>
+              <w:top w:val="single" w:color="B7C4D1" w:sz="4"/>
+              <w:left w:val="single" w:color="B7C4D1" w:sz="4"/>
+              <w:bottom w:val="single" w:color="B7C4D1" w:sz="4"/>
+              <w:right w:val="single" w:color="B7C4D1" w:sz="4"/>
+            </w:tcBorders>
+            <w:tcMar>
+              <w:top w:type="dxa" w:w="60"/>
+              <w:left w:type="dxa" w:w="100"/>
+              <w:bottom w:type="dxa" w:w="60"/>
+              <w:right w:type="dxa" w:w="100"/>
+            </w:tcMar>
+          </w:tcPr>
+          <w:p>
+            <w:pPr>
+              <w:spacing w:after="0"/>
+            </w:pPr>
+            <w:r>
+              <w:rPr>
+                <w:sz w:val="19"/>
+                <w:szCs w:val="19"/>
+              </w:rPr>
+              <w:t xml:space="preserve">91.15</w:t>
+            </w:r>
+          </w:p>
+        </w:tc>
+        <w:tc>
+          <w:tcPr>
+            <w:tcW w:type="dxa" w:w="3426"/>
+            <w:tcBorders>
+              <w:top w:val="single" w:color="B7C4D1" w:sz="4"/>
+              <w:left w:val="single" w:color="B7C4D1" w:sz="4"/>
+              <w:bottom w:val="single" w:color="B7C4D1" w:sz="4"/>
+              <w:right w:val="single" w:color="B7C4D1" w:sz="4"/>
+            </w:tcBorders>
+            <w:tcMar>
+              <w:top w:type="dxa" w:w="60"/>
+              <w:left w:type="dxa" w:w="100"/>
+              <w:bottom w:type="dxa" w:w="60"/>
+              <w:right w:type="dxa" w:w="100"/>
+            </w:tcMar>
+          </w:tcPr>
+          <w:p>
+            <w:pPr>
+              <w:spacing w:after="0"/>
+            </w:pPr>
+            <w:r>
+              <w:rPr>
+                <w:sz w:val="19"/>
+                <w:szCs w:val="19"/>
+              </w:rPr>
+              <w:t xml:space="preserve">Uso de memoria alto</w:t>
+            </w:r>
+          </w:p>
+        </w:tc>
+      </w:tr>
+      <w:tr>
+        <w:tc>
+          <w:tcPr>
+            <w:tcW w:type="dxa" w:w="1900"/>
+            <w:tcBorders>
+              <w:top w:val="single" w:color="B7C4D1" w:sz="4"/>
+              <w:left w:val="single" w:color="B7C4D1" w:sz="4"/>
+              <w:bottom w:val="single" w:color="B7C4D1" w:sz="4"/>
+              <w:right w:val="single" w:color="B7C4D1" w:sz="4"/>
+            </w:tcBorders>
+            <w:tcMar>
+              <w:top w:type="dxa" w:w="60"/>
+              <w:left w:type="dxa" w:w="100"/>
+              <w:bottom w:type="dxa" w:w="60"/>
+              <w:right w:type="dxa" w:w="100"/>
+            </w:tcMar>
+          </w:tcPr>
+          <w:p>
+            <w:pPr>
+              <w:spacing w:after="0"/>
+            </w:pPr>
+            <w:r>
+              <w:rPr>
+                <w:rFonts w:ascii="Courier New" w:cs="Courier New" w:eastAsia="Courier New" w:hAnsi="Courier New"/>
+                <w:sz w:val="19"/>
+                <w:szCs w:val="19"/>
+              </w:rPr>
+              <w:t xml:space="preserve">disco_saturado</w:t>
+            </w:r>
+          </w:p>
+        </w:tc>
+        <w:tc>
+          <w:tcPr>
+            <w:tcW w:type="dxa" w:w="2300"/>
+            <w:tcBorders>
+              <w:top w:val="single" w:color="B7C4D1" w:sz="4"/>
+              <w:left w:val="single" w:color="B7C4D1" w:sz="4"/>
+              <w:bottom w:val="single" w:color="B7C4D1" w:sz="4"/>
+              <w:right w:val="single" w:color="B7C4D1" w:sz="4"/>
+            </w:tcBorders>
+            <w:tcMar>
+              <w:top w:type="dxa" w:w="60"/>
+              <w:left w:type="dxa" w:w="100"/>
+              <w:bottom w:type="dxa" w:w="60"/>
+              <w:right w:type="dxa" w:w="100"/>
+            </w:tcMar>
+          </w:tcPr>
+          <w:p>
+            <w:pPr>
+              <w:spacing w:after="0"/>
+            </w:pPr>
+            <w:r>
+              <w:rPr>
+                <w:rFonts w:ascii="Courier New" w:cs="Courier New" w:eastAsia="Courier New" w:hAnsi="Courier New"/>
+                <w:sz w:val="19"/>
+                <w:szCs w:val="19"/>
+              </w:rPr>
+              <w:t xml:space="preserve">disk_io_percent</w:t>
+            </w:r>
+          </w:p>
+        </w:tc>
+        <w:tc>
+          <w:tcPr>
+            <w:tcW w:type="dxa" w:w="1400"/>
+            <w:tcBorders>
+              <w:top w:val="single" w:color="B7C4D1" w:sz="4"/>
+              <w:left w:val="single" w:color="B7C4D1" w:sz="4"/>
+              <w:bottom w:val="single" w:color="B7C4D1" w:sz="4"/>
+              <w:right w:val="single" w:color="B7C4D1" w:sz="4"/>
+            </w:tcBorders>
+            <w:tcMar>
+              <w:top w:type="dxa" w:w="60"/>
+              <w:left w:type="dxa" w:w="100"/>
+              <w:bottom w:type="dxa" w:w="60"/>
+              <w:right w:type="dxa" w:w="100"/>
+            </w:tcMar>
+          </w:tcPr>
+          <w:p>
+            <w:pPr>
+              <w:spacing w:after="0"/>
+            </w:pPr>
+            <w:r>
+              <w:rPr>
+                <w:sz w:val="19"/>
+                <w:szCs w:val="19"/>
+              </w:rPr>
+              <w:t xml:space="preserve">12.59</w:t>
+            </w:r>
+          </w:p>
+        </w:tc>
+        <w:tc>
+          <w:tcPr>
+            <w:tcW w:type="dxa" w:w="3426"/>
+            <w:tcBorders>
+              <w:top w:val="single" w:color="B7C4D1" w:sz="4"/>
+              <w:left w:val="single" w:color="B7C4D1" w:sz="4"/>
+              <w:bottom w:val="single" w:color="B7C4D1" w:sz="4"/>
+              <w:right w:val="single" w:color="B7C4D1" w:sz="4"/>
+            </w:tcBorders>
+            <w:tcMar>
+              <w:top w:type="dxa" w:w="60"/>
+              <w:left w:type="dxa" w:w="100"/>
+              <w:bottom w:type="dxa" w:w="60"/>
+              <w:right w:type="dxa" w:w="100"/>
+            </w:tcMar>
+          </w:tcPr>
+          <w:p>
+            <w:pPr>
+              <w:spacing w:after="0"/>
+            </w:pPr>
+            <w:r>
+              <w:rPr>
+                <w:sz w:val="19"/>
+                <w:szCs w:val="19"/>
+              </w:rPr>
+              <w:t xml:space="preserve">Uso de disco alto</w:t>
+            </w:r>
+          </w:p>
+        </w:tc>
+      </w:tr>
+      <w:tr>
+        <w:tc>
+          <w:tcPr>
+            <w:tcW w:type="dxa" w:w="1900"/>
+            <w:tcBorders>
+              <w:top w:val="single" w:color="B7C4D1" w:sz="4"/>
+              <w:left w:val="single" w:color="B7C4D1" w:sz="4"/>
+              <w:bottom w:val="single" w:color="B7C4D1" w:sz="4"/>
+              <w:right w:val="single" w:color="B7C4D1" w:sz="4"/>
+            </w:tcBorders>
+            <w:tcMar>
+              <w:top w:type="dxa" w:w="60"/>
+              <w:left w:type="dxa" w:w="100"/>
+              <w:bottom w:type="dxa" w:w="60"/>
+              <w:right w:type="dxa" w:w="100"/>
+            </w:tcMar>
+          </w:tcPr>
+          <w:p>
+            <w:pPr>
+              <w:spacing w:after="0"/>
+            </w:pPr>
+            <w:r>
+              <w:rPr>
+                <w:rFonts w:ascii="Courier New" w:cs="Courier New" w:eastAsia="Courier New" w:hAnsi="Courier New"/>
+                <w:sz w:val="19"/>
+                <w:szCs w:val="19"/>
+              </w:rPr>
+              <w:t xml:space="preserve">red_in_alta</w:t>
+            </w:r>
+          </w:p>
+        </w:tc>
+        <w:tc>
+          <w:tcPr>
+            <w:tcW w:type="dxa" w:w="2300"/>
+            <w:tcBorders>
+              <w:top w:val="single" w:color="B7C4D1" w:sz="4"/>
+              <w:left w:val="single" w:color="B7C4D1" w:sz="4"/>
+              <w:bottom w:val="single" w:color="B7C4D1" w:sz="4"/>
+              <w:right w:val="single" w:color="B7C4D1" w:sz="4"/>
+            </w:tcBorders>
+            <w:tcMar>
+              <w:top w:type="dxa" w:w="60"/>
+              <w:left w:type="dxa" w:w="100"/>
+              <w:bottom w:type="dxa" w:w="60"/>
+              <w:right w:type="dxa" w:w="100"/>
+            </w:tcMar>
+          </w:tcPr>
+          <w:p>
+            <w:pPr>
+              <w:spacing w:after="0"/>
+            </w:pPr>
+            <w:r>
+              <w:rPr>
+                <w:rFonts w:ascii="Courier New" w:cs="Courier New" w:eastAsia="Courier New" w:hAnsi="Courier New"/>
+                <w:sz w:val="19"/>
+                <w:szCs w:val="19"/>
+              </w:rPr>
+              <w:t xml:space="preserve">net_in</w:t>
+            </w:r>
+          </w:p>
+        </w:tc>
+        <w:tc>
+          <w:tcPr>
+            <w:tcW w:type="dxa" w:w="1400"/>
+            <w:tcBorders>
+              <w:top w:val="single" w:color="B7C4D1" w:sz="4"/>
+              <w:left w:val="single" w:color="B7C4D1" w:sz="4"/>
+              <w:bottom w:val="single" w:color="B7C4D1" w:sz="4"/>
+              <w:right w:val="single" w:color="B7C4D1" w:sz="4"/>
+            </w:tcBorders>
+            <w:tcMar>
+              <w:top w:type="dxa" w:w="60"/>
+              <w:left w:type="dxa" w:w="100"/>
+              <w:bottom w:type="dxa" w:w="60"/>
+              <w:right w:type="dxa" w:w="100"/>
+            </w:tcMar>
+          </w:tcPr>
+          <w:p>
+            <w:pPr>
+              <w:spacing w:after="0"/>
+            </w:pPr>
+            <w:r>
+              <w:rPr>
+                <w:sz w:val="19"/>
+                <w:szCs w:val="19"/>
+              </w:rPr>
+              <w:t xml:space="preserve">46.11</w:t>
+            </w:r>
+          </w:p>
+        </w:tc>
+        <w:tc>
+          <w:tcPr>
+            <w:tcW w:type="dxa" w:w="3426"/>
+            <w:tcBorders>
+              <w:top w:val="single" w:color="B7C4D1" w:sz="4"/>
+              <w:left w:val="single" w:color="B7C4D1" w:sz="4"/>
+              <w:bottom w:val="single" w:color="B7C4D1" w:sz="4"/>
+              <w:right w:val="single" w:color="B7C4D1" w:sz="4"/>
+            </w:tcBorders>
+            <w:tcMar>
+              <w:top w:type="dxa" w:w="60"/>
+              <w:left w:type="dxa" w:w="100"/>
+              <w:bottom w:type="dxa" w:w="60"/>
+              <w:right w:type="dxa" w:w="100"/>
+            </w:tcMar>
+          </w:tcPr>
+          <w:p>
+            <w:pPr>
+              <w:spacing w:after="0"/>
+            </w:pPr>
+            <w:r>
+              <w:rPr>
+                <w:sz w:val="19"/>
+                <w:szCs w:val="19"/>
+              </w:rPr>
+              <w:t xml:space="preserve">Tráfico de red entrante alto</w:t>
+            </w:r>
+          </w:p>
+        </w:tc>
+      </w:tr>
+      <w:tr>
+        <w:tc>
+          <w:tcPr>
+            <w:tcW w:type="dxa" w:w="1900"/>
+            <w:tcBorders>
+              <w:top w:val="single" w:color="B7C4D1" w:sz="4"/>
+              <w:left w:val="single" w:color="B7C4D1" w:sz="4"/>
+              <w:bottom w:val="single" w:color="B7C4D1" w:sz="4"/>
+              <w:right w:val="single" w:color="B7C4D1" w:sz="4"/>
+            </w:tcBorders>
+            <w:tcMar>
+              <w:top w:type="dxa" w:w="60"/>
+              <w:left w:type="dxa" w:w="100"/>
+              <w:bottom w:type="dxa" w:w="60"/>
+              <w:right w:type="dxa" w:w="100"/>
+            </w:tcMar>
+          </w:tcPr>
+          <w:p>
+            <w:pPr>
+              <w:spacing w:after="0"/>
+            </w:pPr>
+            <w:r>
+              <w:rPr>
+                <w:rFonts w:ascii="Courier New" w:cs="Courier New" w:eastAsia="Courier New" w:hAnsi="Courier New"/>
+                <w:sz w:val="19"/>
+                <w:szCs w:val="19"/>
+              </w:rPr>
+              <w:t xml:space="preserve">red_out_alta</w:t>
+            </w:r>
+          </w:p>
+        </w:tc>
+        <w:tc>
+          <w:tcPr>
+            <w:tcW w:type="dxa" w:w="2300"/>
+            <w:tcBorders>
+              <w:top w:val="single" w:color="B7C4D1" w:sz="4"/>
+              <w:left w:val="single" w:color="B7C4D1" w:sz="4"/>
+              <w:bottom w:val="single" w:color="B7C4D1" w:sz="4"/>
+              <w:right w:val="single" w:color="B7C4D1" w:sz="4"/>
+            </w:tcBorders>
+            <w:tcMar>
+              <w:top w:type="dxa" w:w="60"/>
+              <w:left w:type="dxa" w:w="100"/>
+              <w:bottom w:type="dxa" w:w="60"/>
+              <w:right w:type="dxa" w:w="100"/>
+            </w:tcMar>
+          </w:tcPr>
+          <w:p>
+            <w:pPr>
+              <w:spacing w:after="0"/>
+            </w:pPr>
+            <w:r>
+              <w:rPr>
+                <w:rFonts w:ascii="Courier New" w:cs="Courier New" w:eastAsia="Courier New" w:hAnsi="Courier New"/>
+                <w:sz w:val="19"/>
+                <w:szCs w:val="19"/>
+              </w:rPr>
+              <w:t xml:space="preserve">net_out</w:t>
+            </w:r>
+          </w:p>
+        </w:tc>
+        <w:tc>
+          <w:tcPr>
+            <w:tcW w:type="dxa" w:w="1400"/>
+            <w:tcBorders>
+              <w:top w:val="single" w:color="B7C4D1" w:sz="4"/>
+              <w:left w:val="single" w:color="B7C4D1" w:sz="4"/>
+              <w:bottom w:val="single" w:color="B7C4D1" w:sz="4"/>
+              <w:right w:val="single" w:color="B7C4D1" w:sz="4"/>
+            </w:tcBorders>
+            <w:tcMar>
+              <w:top w:type="dxa" w:w="60"/>
+              <w:left w:type="dxa" w:w="100"/>
+              <w:bottom w:type="dxa" w:w="60"/>
+              <w:right w:type="dxa" w:w="100"/>
+            </w:tcMar>
+          </w:tcPr>
+          <w:p>
+            <w:pPr>
+              <w:spacing w:after="0"/>
+            </w:pPr>
+            <w:r>
+              <w:rPr>
+                <w:sz w:val="19"/>
+                <w:szCs w:val="19"/>
+              </w:rPr>
+              <w:t xml:space="preserve">36.61</w:t>
+            </w:r>
+          </w:p>
+        </w:tc>
+        <w:tc>
+          <w:tcPr>
+            <w:tcW w:type="dxa" w:w="3426"/>
+            <w:tcBorders>
+              <w:top w:val="single" w:color="B7C4D1" w:sz="4"/>
+              <w:left w:val="single" w:color="B7C4D1" w:sz="4"/>
+              <w:bottom w:val="single" w:color="B7C4D1" w:sz="4"/>
+              <w:right w:val="single" w:color="B7C4D1" w:sz="4"/>
+            </w:tcBorders>
+            <w:tcMar>
+              <w:top w:type="dxa" w:w="60"/>
+              <w:left w:type="dxa" w:w="100"/>
+              <w:bottom w:type="dxa" w:w="60"/>
+              <w:right w:type="dxa" w:w="100"/>
+            </w:tcMar>
+          </w:tcPr>
+          <w:p>
+            <w:pPr>
+              <w:spacing w:after="0"/>
+            </w:pPr>
+            <w:r>
+              <w:rPr>
+                <w:sz w:val="19"/>
+                <w:szCs w:val="19"/>
+              </w:rPr>
+              <w:t xml:space="preserve">Tráfico de red saliente alto</w:t>
+            </w:r>
+          </w:p>
+        </w:tc>
+      </w:tr>
+    </w:tbl>
+    <w:p>
+      <w:pPr>
+        <w:spacing w:after="120" w:before="120"/>
+        <w:jc w:val="both"/>
+      </w:pPr>
+      <w:r>
+        <w:t xml:space="preserve">Estos umbrales también están en </w:t>
       </w:r>
       <w:r>
         <w:rPr>
@@ -638,7 +1649,7 @@
         <w:t xml:space="preserve">metadatos_variables.csv</w:t>
       </w:r>
       <w:r>
-        <w:t xml:space="preserve">).</w:t>
+        <w:t xml:space="preserve">.</w:t>
       </w:r>
     </w:p>
     <w:p>
@@ -651,7 +1662,7 @@
         <w:spacing w:after="60" w:line="276"/>
       </w:pPr>
       <w:r>
-        <w:t xml:space="preserve">1634 registros (72.85 %) no tienen ninguna alerta y se descartan, porque el vector nulo no puede procesarse.</w:t>
+        <w:t xml:space="preserve">1634 registros (72.85 %) no tienen ninguna alerta y se descartan, porque la red no puede procesar registros con todos los valores en 0 (el test de vigilancia dividiría por cero).</w:t>
       </w:r>
     </w:p>
     <w:p>
@@ -664,7 +1675,7 @@
         <w:spacing w:after="60" w:line="276"/>
       </w:pPr>
       <w:r>
-        <w:t xml:space="preserve">Quedan 609 registros con actividad: 463 con 1 o 2 alertas simultáneas y 146 con 3 o más.</w:t>
+        <w:t xml:space="preserve">Quedan 609 registros con al menos una alerta: 463 con 1 o 2 alertas al mismo tiempo y 146 con 3 o más.</w:t>
       </w:r>
     </w:p>
     <w:p>
@@ -681,10 +1692,10 @@
           <w:b/>
           <w:bCs/>
         </w:rPr>
-        <w:t xml:space="preserve">Dataset 1, régimen nominal:</w:t>
-      </w:r>
-      <w:r>
-        <w:t xml:space="preserve"> 100 de los 463 registros con 1 o 2 alertas, elegidos con semilla fija (42) y en orden temporal.</w:t>
+        <w:t xml:space="preserve">Dataset 1, funcionamiento normal (nominal):</w:t>
+      </w:r>
+      <w:r>
+        <w:t xml:space="preserve"> 100 de los 463 registros con 1 o 2 alertas, elegidos al azar y ordenados en el tiempo. Se usó una semilla fija (42), un número que hace que la elección al azar sea siempre la misma, para que el dataset se pueda volver a generar idéntico.</w:t>
       </w:r>
     </w:p>
     <w:p>
@@ -701,7 +1712,7 @@
           <w:b/>
           <w:bCs/>
         </w:rPr>
-        <w:t xml:space="preserve">Dataset 2, régimen de estrés:</w:t>
+        <w:t xml:space="preserve">Dataset 2, funcionamiento bajo estrés:</w:t>
       </w:r>
       <w:r>
         <w:t xml:space="preserve"> los primeros 100 registros con 3 o más alertas.</w:t>
@@ -717,7 +1728,7 @@
         <w:spacing w:after="60" w:line="276"/>
       </w:pPr>
       <w:r>
-        <w:t xml:space="preserve">Los datasets no comparten registros y en los dos varían las 5 variables.</w:t>
+        <w:t xml:space="preserve">Los dos datasets no tienen registros en común, y en ambos las 5 variables toman los valores 0 y 1.</w:t>
       </w:r>
     </w:p>
     <w:p>
@@ -726,7 +1737,7 @@
         <w:jc w:val="both"/>
       </w:pPr>
       <w:r>
-        <w:t xml:space="preserve">Combinaciones presentes en cada dataset (orden: cpu_alta, ram_alta, disco_saturado, red_in_alta, red_out_alta):</w:t>
+        <w:t xml:space="preserve">Combinaciones de alertas presentes en cada dataset (el orden de los valores es: cpu_alta, ram_alta, disco_saturado, red_in_alta, red_out_alta):</w:t>
       </w:r>
     </w:p>
     <w:p>
@@ -734,7 +1745,7 @@
         <w:pStyle w:val="Heading3"/>
       </w:pPr>
       <w:r>
-        <w:t xml:space="preserve">Dataset 1: régimen nominal</w:t>
+        <w:t xml:space="preserve">Dataset 1: funcionamiento normal</w:t>
       </w:r>
     </w:p>
     <w:tbl>
@@ -786,7 +1797,7 @@
                 <w:sz w:val="19"/>
                 <w:szCs w:val="19"/>
               </w:rPr>
-              <w:t xml:space="preserve">Patrón</w:t>
+              <w:t xml:space="preserve">Combinación</w:t>
             </w:r>
           </w:p>
         </w:tc>
@@ -1573,7 +2584,7 @@
         <w:pStyle w:val="Heading3"/>
       </w:pPr>
       <w:r>
-        <w:t xml:space="preserve">Dataset 2: régimen de estrés</w:t>
+        <w:t xml:space="preserve">Dataset 2: funcionamiento bajo estrés</w:t>
       </w:r>
     </w:p>
     <w:tbl>
@@ -1625,7 +2636,7 @@
                 <w:sz w:val="19"/>
                 <w:szCs w:val="19"/>
               </w:rPr>
-              <w:t xml:space="preserve">Patrón</w:t>
+              <w:t xml:space="preserve">Combinación</w:t>
             </w:r>
           </w:p>
         </w:tc>
@@ -2418,7 +3429,7 @@
         <w:jc w:val="both"/>
       </w:pPr>
       <w:r>
-        <w:t xml:space="preserve">En ambos regímenes la red entrante y la saliente aparecen casi siempre juntas: en el nominal, la única excepción es un registro [0, 0, 1, 0, 1].</w:t>
+        <w:t xml:space="preserve">En los dos casos, el tráfico de red entrante y el saliente aparecen casi siempre juntos. La única excepción es un registro del dataset normal con la combinación [0, 0, 1, 0, 1].</w:t>
       </w:r>
     </w:p>
     <w:p>
@@ -2426,7 +3437,7 @@
         <w:pStyle w:val="Heading1"/>
       </w:pPr>
       <w:r>
-        <w:t xml:space="preserve">4. Metodología</w:t>
+        <w:t xml:space="preserve">5. Metodología</w:t>
       </w:r>
     </w:p>
     <w:p>
@@ -2435,7 +3446,7 @@
         <w:jc w:val="both"/>
       </w:pPr>
       <w:r>
-        <w:t xml:space="preserve">Todas las corridas se hicieron con Python 3.12 y son deterministas. Se reproducen con:</w:t>
+        <w:t xml:space="preserve">Todas las corridas se hicieron con Python 3.12. Son deterministas: con los mismos datos y parámetros dan siempre el mismo resultado. Se reproducen con:</w:t>
       </w:r>
     </w:p>
     <w:p>
@@ -2670,7 +3681,7 @@
                 <w:sz w:val="19"/>
                 <w:szCs w:val="19"/>
               </w:rPr>
-              <w:t xml:space="preserve">M, tamaños y prototipos para ρ = 0.1, 0.3, 0.5, 0.7 y 0.9</w:t>
+              <w:t xml:space="preserve">Cantidad de grupos (M), tamaño de cada grupo y prototipos, para ρ = 0.1, 0.3, 0.5, 0.7 y 0.9</w:t>
             </w:r>
           </w:p>
         </w:tc>
@@ -2760,7 +3771,7 @@
                 <w:sz w:val="19"/>
                 <w:szCs w:val="19"/>
               </w:rPr>
-              <w:t xml:space="preserve">Categorías acumuladas a medida que se presentan los patrones (ρ = 0.5)</w:t>
+              <w:t xml:space="preserve">Cuántos grupos hay a medida que se presentan los registros (ρ = 0.5)</w:t>
             </w:r>
           </w:p>
         </w:tc>
@@ -2850,7 +3861,7 @@
                 <w:sz w:val="19"/>
                 <w:szCs w:val="19"/>
               </w:rPr>
-              <w:t xml:space="preserve">M y tamaños con 20 órdenes aleatorios (semillas 0 a 19), ρ = 0.3 y 0.5</w:t>
+              <w:t xml:space="preserve">M y tamaño de los grupos con 20 órdenes al azar (semillas 0 a 19), para ρ = 0.3 y 0.5</w:t>
             </w:r>
           </w:p>
         </w:tc>
@@ -2911,7 +3922,7 @@
                 <w:sz w:val="19"/>
                 <w:szCs w:val="19"/>
               </w:rPr>
-              <w:t xml:space="preserve">4. Base y luego estrés</w:t>
+              <w:t xml:space="preserve">4. Normal y luego estrés</w:t>
             </w:r>
           </w:p>
         </w:tc>
@@ -2940,7 +3951,7 @@
                 <w:sz w:val="19"/>
                 <w:szCs w:val="19"/>
               </w:rPr>
-              <w:t xml:space="preserve">Pureza respecto del régimen de origen y registros de estrés absorbidos por categorías nominales</w:t>
+              <w:t xml:space="preserve">Pureza de los grupos y cantidad de registros de estrés que quedan en grupos del funcionamiento normal</w:t>
             </w:r>
           </w:p>
         </w:tc>
@@ -2987,7 +3998,7 @@
         <w:jc w:val="both"/>
       </w:pPr>
       <w:r>
-        <w:t xml:space="preserve">Como no existen etiquetas reales de anomalía, la </w:t>
+        <w:t xml:space="preserve">Como no hay etiquetas reales de anomalía, la </w:t>
       </w:r>
       <w:r>
         <w:rPr>
@@ -2997,7 +4008,7 @@
         <w:t xml:space="preserve">pureza</w:t>
       </w:r>
       <w:r>
-        <w:t xml:space="preserve"> se mide contra el régimen de origen de cada registro (nominal o estrés): para cada categoría se cuenta su régimen mayoritario y se suma sobre todas las categorías. Una pureza de 1 significa que ninguna categoría mezcla registros de los dos regímenes.</w:t>
+        <w:t xml:space="preserve"> se mide contra el dataset de origen de cada registro (normal o estrés). Para cada grupo se cuenta cuántos registros pertenecen al origen más frecuente dentro del grupo; esos conteos se suman y se dividen por el total de registros. Una pureza de 1 significa que ningún grupo mezcla registros de los dos orígenes.</w:t>
       </w:r>
     </w:p>
     <w:p>
@@ -3005,7 +4016,7 @@
         <w:pStyle w:val="Heading1"/>
       </w:pPr>
       <w:r>
-        <w:t xml:space="preserve">5. Resultados</w:t>
+        <w:t xml:space="preserve">6. Resultados</w:t>
       </w:r>
     </w:p>
     <w:p>
@@ -3013,7 +4024,16 @@
         <w:pStyle w:val="Heading2"/>
       </w:pPr>
       <w:r>
-        <w:t xml:space="preserve">5.1 Sensibilidad a la vigilancia</w:t>
+        <w:t xml:space="preserve">6.1 Sensibilidad a la vigilancia</w:t>
+      </w:r>
+    </w:p>
+    <w:p>
+      <w:pPr>
+        <w:spacing w:after="120" w:line="288"/>
+        <w:jc w:val="both"/>
+      </w:pPr>
+      <w:r>
+        <w:t xml:space="preserve">La tabla muestra la cantidad de grupos (M) y la cantidad de registros de cada grupo, en el orden en que la red los creó:</w:t>
       </w:r>
     </w:p>
     <w:tbl>
@@ -3099,7 +4119,7 @@
                 <w:sz w:val="19"/>
                 <w:szCs w:val="19"/>
               </w:rPr>
-              <w:t xml:space="preserve">M nominal</w:t>
+              <w:t xml:space="preserve">M normal</w:t>
             </w:r>
           </w:p>
         </w:tc>
@@ -3131,7 +4151,7 @@
                 <w:sz w:val="19"/>
                 <w:szCs w:val="19"/>
               </w:rPr>
-              <w:t xml:space="preserve">Tamaños (nominal)</w:t>
+              <w:t xml:space="preserve">Tamaños (normal)</w:t>
             </w:r>
           </w:p>
         </w:tc>
@@ -4000,7 +5020,7 @@
           <w:sz w:val="18"/>
           <w:szCs w:val="18"/>
         </w:rPr>
-        <w:t xml:space="preserve">Figura 1. Categorías formadas (M) según la vigilancia ρ en cada dataset.</w:t>
+        <w:t xml:space="preserve">Figura 1. Cantidad de grupos formados (M) según la vigilancia ρ en cada dataset.</w:t>
       </w:r>
     </w:p>
     <w:p>
@@ -4009,7 +5029,7 @@
         <w:jc w:val="both"/>
       </w:pPr>
       <w:r>
-        <w:t xml:space="preserve">Prototipos aprendidos con ρ = 0.5 (salida del test demo):</w:t>
+        <w:t xml:space="preserve">Prototipos aprendidos con ρ = 0.5 (es la salida del test demo del manual):</w:t>
       </w:r>
     </w:p>
     <w:p>
@@ -4017,7 +5037,7 @@
         <w:pStyle w:val="Heading3"/>
       </w:pPr>
       <w:r>
-        <w:t xml:space="preserve">Régimen nominal, ρ = 0.5</w:t>
+        <w:t xml:space="preserve">Funcionamiento normal, ρ = 0.5</w:t>
       </w:r>
     </w:p>
     <w:tbl>
@@ -4069,7 +5089,7 @@
                 <w:sz w:val="19"/>
                 <w:szCs w:val="19"/>
               </w:rPr>
-              <w:t xml:space="preserve">Nodo F2</w:t>
+              <w:t xml:space="preserve">Grupo (nodo F2)</w:t>
             </w:r>
           </w:p>
         </w:tc>
@@ -4101,7 +5121,7 @@
                 <w:sz w:val="19"/>
                 <w:szCs w:val="19"/>
               </w:rPr>
-              <w:t xml:space="preserve">Prototipo top-down</w:t>
+              <w:t xml:space="preserve">Prototipo</w:t>
             </w:r>
           </w:p>
         </w:tc>
@@ -4856,7 +5876,7 @@
         <w:pStyle w:val="Heading3"/>
       </w:pPr>
       <w:r>
-        <w:t xml:space="preserve">Régimen de estrés, ρ = 0.5</w:t>
+        <w:t xml:space="preserve">Funcionamiento bajo estrés, ρ = 0.5</w:t>
       </w:r>
     </w:p>
     <w:tbl>
@@ -4908,7 +5928,7 @@
                 <w:sz w:val="19"/>
                 <w:szCs w:val="19"/>
               </w:rPr>
-              <w:t xml:space="preserve">Nodo F2</w:t>
+              <w:t xml:space="preserve">Grupo (nodo F2)</w:t>
             </w:r>
           </w:p>
         </w:tc>
@@ -4940,7 +5960,7 @@
                 <w:sz w:val="19"/>
                 <w:szCs w:val="19"/>
               </w:rPr>
-              <w:t xml:space="preserve">Prototipo top-down</w:t>
+              <w:t xml:space="preserve">Prototipo</w:t>
             </w:r>
           </w:p>
         </w:tc>
@@ -5339,7 +6359,7 @@
         <w:pStyle w:val="Heading3"/>
       </w:pPr>
       <w:r>
-        <w:t xml:space="preserve">Régimen de estrés, ρ = 0.3</w:t>
+        <w:t xml:space="preserve">Funcionamiento bajo estrés, ρ = 0.3</w:t>
       </w:r>
     </w:p>
     <w:tbl>
@@ -5391,7 +6411,7 @@
                 <w:sz w:val="19"/>
                 <w:szCs w:val="19"/>
               </w:rPr>
-              <w:t xml:space="preserve">Nodo F2</w:t>
+              <w:t xml:space="preserve">Grupo (nodo F2)</w:t>
             </w:r>
           </w:p>
         </w:tc>
@@ -5423,7 +6443,7 @@
                 <w:sz w:val="19"/>
                 <w:szCs w:val="19"/>
               </w:rPr>
-              <w:t xml:space="preserve">Prototipo top-down</w:t>
+              <w:t xml:space="preserve">Prototipo</w:t>
             </w:r>
           </w:p>
         </w:tc>
@@ -5644,7 +6664,7 @@
         <w:pStyle w:val="Heading2"/>
       </w:pPr>
       <w:r>
-        <w:t xml:space="preserve">5.2 Evolución de M</w:t>
+        <w:t xml:space="preserve">6.2 Evolución de M</w:t>
       </w:r>
     </w:p>
     <w:p>
@@ -5706,7 +6726,7 @@
           <w:sz w:val="18"/>
           <w:szCs w:val="18"/>
         </w:rPr>
-        <w:t xml:space="preserve">Figura 2. Categorías acumuladas a medida que se presentan los patrones (ρ = 0.5).</w:t>
+        <w:t xml:space="preserve">Figura 2. Cantidad de grupos acumulados a medida que se presentan los registros (ρ = 0.5).</w:t>
       </w:r>
     </w:p>
     <w:p>
@@ -5715,7 +6735,7 @@
         <w:jc w:val="both"/>
       </w:pPr>
       <w:r>
-        <w:t xml:space="preserve">En el régimen de estrés las 4 categorías aparecen en los primeros 27 patrones y la red queda estable el resto de la secuencia. En el régimen nominal se crean categorías nuevas hasta el patrón 80, porque las combinaciones raras (1 % a 3 % de los registros) aparecen tarde y cada una abre un nodo propio.</w:t>
+        <w:t xml:space="preserve">En el dataset de estrés, los 4 grupos aparecen dentro de los primeros 27 registros y después la red ya no crea grupos nuevos. En el dataset normal se crean grupos hasta el registro 80, porque las combinaciones poco frecuentes (entre 1 % y 3 % de los registros) aparecen tarde y cada una abre un grupo propio.</w:t>
       </w:r>
     </w:p>
     <w:p>
@@ -5723,7 +6743,16 @@
         <w:pStyle w:val="Heading2"/>
       </w:pPr>
       <w:r>
-        <w:t xml:space="preserve">5.3 Efecto del orden de presentación</w:t>
+        <w:t xml:space="preserve">6.3 Efecto del orden de presentación</w:t>
+      </w:r>
+    </w:p>
+    <w:p>
+      <w:pPr>
+        <w:spacing w:after="120" w:line="288"/>
+        <w:jc w:val="both"/>
+      </w:pPr>
+      <w:r>
+        <w:t xml:space="preserve">Se repitió la corrida 20 veces, cada una con los registros mezclados en un orden al azar distinto. La última columna indica en cuántas de esas 20 corridas se obtuvo una partición distinta, es decir, un reparto diferente de los registros entre los grupos:</w:t>
       </w:r>
     </w:p>
     <w:tbl>
@@ -5840,7 +6869,7 @@
                 <w:sz w:val="19"/>
                 <w:szCs w:val="19"/>
               </w:rPr>
-              <w:t xml:space="preserve">M observado en 20 órdenes</w:t>
+              <w:t xml:space="preserve">M obtenido en los 20 órdenes</w:t>
             </w:r>
           </w:p>
         </w:tc>
@@ -6355,7 +7384,7 @@
         <w:pStyle w:val="Heading2"/>
       </w:pPr>
       <w:r>
-        <w:t xml:space="preserve">5.4 Régimen nominal y luego estrés</w:t>
+        <w:t xml:space="preserve">6.4 Funcionamiento normal y luego estrés</w:t>
       </w:r>
     </w:p>
     <w:p>
@@ -6364,7 +7393,7 @@
         <w:jc w:val="both"/>
       </w:pPr>
       <w:r>
-        <w:t xml:space="preserve">Se presentaron a la red los 100 registros nominales seguidos de los 100 de estrés, como si la red monitoreara el servidor y, después de aprender la operación normal, llegara un período de carga.</w:t>
+        <w:t xml:space="preserve">Se presentaron a la red los 100 registros del funcionamiento normal y, a continuación, los 100 de estrés. Esto simula una red que monitorea el servidor, aprende primero cómo funciona normalmente y luego recibe un período de carga.</w:t>
       </w:r>
     </w:p>
     <w:tbl>
@@ -6513,7 +7542,7 @@
                 <w:sz w:val="19"/>
                 <w:szCs w:val="19"/>
               </w:rPr>
-              <w:t xml:space="preserve">Registros de estrés en categorías nominales</w:t>
+              <w:t xml:space="preserve">Registros de estrés en grupos del funcionamiento normal</w:t>
             </w:r>
           </w:p>
         </w:tc>
@@ -7114,7 +8143,7 @@
         <w:pStyle w:val="Heading1"/>
       </w:pPr>
       <w:r>
-        <w:t xml:space="preserve">6. Evaluación de los resultados</w:t>
+        <w:t xml:space="preserve">7. Evaluación de los resultados</w:t>
       </w:r>
     </w:p>
     <w:p>
@@ -7122,7 +8151,7 @@
         <w:pStyle w:val="Heading2"/>
       </w:pPr>
       <w:r>
-        <w:t xml:space="preserve">6.1 Los estados descubiertos son coherentes</w:t>
+        <w:t xml:space="preserve">7.1 Los estados descubiertos tienen sentido</w:t>
       </w:r>
     </w:p>
     <w:p>
@@ -7131,7 +8160,7 @@
         <w:jc w:val="both"/>
       </w:pPr>
       <w:r>
-        <w:t xml:space="preserve">Con ρ = 0.5 los prototipos se interpretan directamente como estados del servidor. En el régimen nominal la red separa alertas aisladas de disco (23 %), de CPU (21 %) y de memoria (12 %), la combinación CPU + disco (18 %) y un estado de tráfico de red alto en ambos sentidos (21 %). En el régimen de estrés el estado dominante es memoria + red alta (57 %), seguido de CPU + memoria + disco (19 %): dos tipos de carga claramente distintos, uno ligado a la red y otro al procesamiento.</w:t>
+        <w:t xml:space="preserve">Con ρ = 0.5, los prototipos se pueden leer directamente como estados del servidor. En el funcionamiento normal la red separa las alertas aisladas de disco (23 %), de CPU (21 %) y de memoria (12 %), la combinación de CPU y disco (18 %) y un estado de tráfico de red alto en ambos sentidos (21 %). En el funcionamiento bajo estrés, el estado más frecuente es memoria y red altas (57 %), seguido de CPU, memoria y disco altos al mismo tiempo (19 %): son dos tipos de carga claramente distintos, uno asociado a la red y otro al procesamiento.</w:t>
       </w:r>
     </w:p>
     <w:p>
@@ -7139,7 +8168,7 @@
         <w:pStyle w:val="Heading2"/>
       </w:pPr>
       <w:r>
-        <w:t xml:space="preserve">6.2 Efecto de la vigilancia</w:t>
+        <w:t xml:space="preserve">7.2 Efecto de la vigilancia</w:t>
       </w:r>
     </w:p>
     <w:p>
@@ -7156,10 +8185,10 @@
           <w:b/>
           <w:bCs/>
         </w:rPr>
-        <w:t xml:space="preserve">Régimen nominal:</w:t>
-      </w:r>
-      <w:r>
-        <w:t xml:space="preserve"> M salta de 4 a 8 entre ρ = 0.3 y ρ = 0.5 y no cambia después. La explicación es aritmética: los registros tienen 1 o 2 alertas, así que la coincidencia con un prototipo distinto vale como máximo 1/2 = 0.5. Como el test es estricto (&gt; ρ), con ρ ≥ 0.5 cada combinación termina en su propia categoría; con ρ &lt; 0.5 los registros de 2 alertas se fusionan con prototipos de 1 alerta.</w:t>
+        <w:t xml:space="preserve">Funcionamiento normal:</w:t>
+      </w:r>
+      <w:r>
+        <w:t xml:space="preserve"> M pasa de 4 a 8 entre ρ = 0.3 y ρ = 0.5 y después no cambia. La explicación es aritmética: los registros tienen 1 o 2 alertas, así que su parecido con el prototipo de otra combinación vale como máximo 1/2 = 0.5. Como el test exige superar ρ (no alcanza con igualarlo), con ρ ≥ 0.5 cada combinación queda en su propio grupo; con ρ &lt; 0.5, los registros de 2 alertas se unen a prototipos de 1 alerta.</w:t>
       </w:r>
     </w:p>
     <w:p>
@@ -7176,10 +8205,10 @@
           <w:b/>
           <w:bCs/>
         </w:rPr>
-        <w:t xml:space="preserve">Régimen de estrés:</w:t>
-      </w:r>
-      <w:r>
-        <w:t xml:space="preserve"> M crece de forma gradual (2, 4, 5, 7). Con ρ ≤ 0.3 la red resume el régimen en dos grandes estados: procesamiento (CPU + memoria + disco) y red. Con ρ = 0.9 casi cada combinación tiene su nodo.</w:t>
+        <w:t xml:space="preserve">Funcionamiento bajo estrés:</w:t>
+      </w:r>
+      <w:r>
+        <w:t xml:space="preserve"> M crece de forma gradual (2, 4, 5 y 7). Con ρ ≤ 0.3 la red resume el período en dos grandes estados: procesamiento (CPU, memoria y disco) y red. Con ρ = 0.9 casi cada combinación tiene su propio grupo.</w:t>
       </w:r>
     </w:p>
     <w:p>
@@ -7192,7 +8221,7 @@
         <w:spacing w:after="60" w:line="276"/>
       </w:pPr>
       <w:r>
-        <w:t xml:space="preserve">Esto confirma lo que plantea la propuesta: una vigilancia baja produce pocas categorías amplias y una alta, muchas categorías específicas.</w:t>
+        <w:t xml:space="preserve">Esto confirma lo que planteaba la propuesta: una vigilancia baja produce pocos grupos amplios y una alta, muchos grupos específicos.</w:t>
       </w:r>
     </w:p>
     <w:p>
@@ -7200,7 +8229,7 @@
         <w:pStyle w:val="Heading2"/>
       </w:pPr>
       <w:r>
-        <w:t xml:space="preserve">6.3 Efecto del AND: generalización y erosión</w:t>
+        <w:t xml:space="preserve">7.3 Efecto del AND: generalización y erosión</w:t>
       </w:r>
     </w:p>
     <w:p>
@@ -7209,7 +8238,27 @@
         <w:jc w:val="both"/>
       </w:pPr>
       <w:r>
-        <w:t xml:space="preserve">En el régimen de estrés con ρ = 0.5, el prototipo del nodo 01 es [0, 0, 0, 1, 1], una combinación que no existe en el dataset (todos los registros tienen 3 o más alertas). Es la intersección de los registros que absorbió: la red generalizó la característica común (tráfico de red alto) y descartó lo demás. Este mismo mecanismo es el que vuelve a la red sensible al ruido, porque un bit perdido nunca se recupera en el prototipo.</w:t>
+        <w:t xml:space="preserve">En el dataset de estrés con ρ = 0.5, el prototipo del grupo 01 es [0, 0, 0, 1, 1], una combinación que no aparece en el dataset (todos sus registros tienen 3 alertas o más). Es lo que tienen en común los registros de ese grupo: la red </w:t>
+      </w:r>
+      <w:r>
+        <w:rPr>
+          <w:b/>
+          <w:bCs/>
+        </w:rPr>
+        <w:t xml:space="preserve">generalizó</w:t>
+      </w:r>
+      <w:r>
+        <w:t xml:space="preserve">, es decir, se quedó con el rasgo compartido (tráfico de red alto) y descartó el resto. Este mismo mecanismo hace que la red sea sensible al ruido: un 1 que se pierde por un error de medición desaparece del prototipo y ya no se recupera, lo que se conoce como </w:t>
+      </w:r>
+      <w:r>
+        <w:rPr>
+          <w:b/>
+          <w:bCs/>
+        </w:rPr>
+        <w:t xml:space="preserve">erosión</w:t>
+      </w:r>
+      <w:r>
+        <w:t xml:space="preserve"> del prototipo.</w:t>
       </w:r>
     </w:p>
     <w:p>
@@ -7217,7 +8266,7 @@
         <w:pStyle w:val="Heading2"/>
       </w:pPr>
       <w:r>
-        <w:t xml:space="preserve">6.4 Dependencia del orden</w:t>
+        <w:t xml:space="preserve">7.4 Dependencia del orden</w:t>
       </w:r>
     </w:p>
     <w:p>
@@ -7226,7 +8275,7 @@
         <w:jc w:val="both"/>
       </w:pPr>
       <w:r>
-        <w:t xml:space="preserve">Con ρ = 0.5 la cantidad de categorías no cambió en 20 órdenes aleatorios, pero la distribución de los registros entre ellas sí: en el régimen de estrés, los 20 órdenes produjeron 20 particiones distintas. Con ρ = 0.3, en el régimen de estrés M fue 2 en 12 órdenes y 3 en los otros 8. Es la limitación esperable del algoritmo del líder: el primer registro de cada grupo condiciona el prototipo.</w:t>
+        <w:t xml:space="preserve">Con ρ = 0.5, la cantidad de grupos fue la misma en los 20 órdenes al azar, pero el reparto de los registros entre los grupos cambió: en el dataset de estrés, los 20 órdenes dieron 20 particiones distintas. Con ρ = 0.3, en el dataset de estrés se obtuvieron 2 grupos en 12 órdenes y 3 grupos en los otros 8. Es la limitación esperable del algoritmo del líder, porque el primer registro de cada grupo condiciona su prototipo.</w:t>
       </w:r>
     </w:p>
     <w:p>
@@ -7234,7 +8283,7 @@
         <w:pStyle w:val="Heading2"/>
       </w:pPr>
       <w:r>
-        <w:t xml:space="preserve">6.5 Detección del régimen nuevo</w:t>
+        <w:t xml:space="preserve">7.5 Detección del período de estrés</w:t>
       </w:r>
     </w:p>
     <w:p>
@@ -7257,7 +8306,7 @@
         <w:t xml:space="preserve">ρ ≥ 0.7</w:t>
       </w:r>
       <w:r>
-        <w:t xml:space="preserve"> ningún registro de estrés cae en una categoría aprendida durante la operación normal y la pureza es 1. La llegada del régimen de estrés se manifiesta como la creación de 5 categorías nuevas, que es exactamente la definición operativa de anomalía de la propuesta.</w:t>
+        <w:t xml:space="preserve">, ningún registro de estrés queda en un grupo aprendido durante el funcionamiento normal y la pureza es 1. La llegada del estrés se manifiesta como la creación de 5 grupos nuevos, que es exactamente la definición de anomalía de la sección 2.1.</w:t>
       </w:r>
     </w:p>
     <w:p>
@@ -7280,7 +8329,7 @@
         <w:t xml:space="preserve">ρ = 0.5</w:t>
       </w:r>
       <w:r>
-        <w:t xml:space="preserve"> se absorben 27 de 100 registros de estrés. Por ejemplo, los 17 registros CPU + memoria + disco caen en la categoría nominal CPU + disco, porque coinciden en 2 de 3 alertas (0.67 &gt; 0.5).</w:t>
+        <w:t xml:space="preserve">, 27 de los 100 registros de estrés quedan en grupos del funcionamiento normal. Por ejemplo, los 17 registros con CPU, memoria y disco altos quedan en el grupo normal de CPU y disco, porque coinciden en 2 de sus 3 alertas (2/3 = 0.67, que supera 0.5).</w:t>
       </w:r>
     </w:p>
     <w:p>
@@ -7303,7 +8352,7 @@
         <w:t xml:space="preserve">ρ ≤ 0.3</w:t>
       </w:r>
       <w:r>
-        <w:t xml:space="preserve"> se absorben 96 de 100: la red ya no distingue el estrés de la operación normal.</w:t>
+        <w:t xml:space="preserve">, quedan 96 de 100: la red ya no distingue el estrés del funcionamiento normal.</w:t>
       </w:r>
     </w:p>
     <w:p>
@@ -7319,7 +8368,7 @@
         <w:t xml:space="preserve">Conclusión práctica:</w:t>
       </w:r>
       <w:r>
-        <w:t xml:space="preserve"> para monitorear este servidor, ρ = 0.7 separa sin errores los dos regímenes con 13 categorías. ρ = 0.5 sirve para resumir cada régimen por separado, pero no alcanza como detector.</w:t>
+        <w:t xml:space="preserve"> para monitorear este servidor, ρ = 0.7 separa sin errores los dos períodos y forma 13 grupos en total. ρ = 0.5 sirve para describir cada período por separado, pero no alcanza para detectar el estrés.</w:t>
       </w:r>
     </w:p>
     <w:p>
@@ -7327,7 +8376,7 @@
         <w:pStyle w:val="Heading1"/>
       </w:pPr>
       <w:r>
-        <w:t xml:space="preserve">7. Cambios respecto de la propuesta de entrega parcial</w:t>
+        <w:t xml:space="preserve">8. Cambios respecto de la propuesta de entrega parcial</w:t>
       </w:r>
     </w:p>
     <w:tbl>
@@ -7532,7 +8581,7 @@
                 <w:sz w:val="19"/>
                 <w:szCs w:val="19"/>
               </w:rPr>
-              <w:t xml:space="preserve">El dataset disponible no registra hilos ni bloqueos; sí registra tráfico de red.</w:t>
+              <w:t xml:space="preserve">El dataset disponible no registra hilos ni bloqueos, pero sí tráfico de red.</w:t>
             </w:r>
           </w:p>
         </w:tc>
@@ -7592,7 +8641,7 @@
                 <w:sz w:val="19"/>
                 <w:szCs w:val="19"/>
               </w:rPr>
-              <w:t xml:space="preserve">Percentil 90 de cada métrica</w:t>
+              <w:t xml:space="preserve">Percentil 90 de cada medición</w:t>
             </w:r>
           </w:p>
         </w:tc>
@@ -7621,7 +8670,7 @@
                 <w:sz w:val="19"/>
                 <w:szCs w:val="19"/>
               </w:rPr>
-              <w:t xml:space="preserve">Con CPU &gt; 80 % no habría ninguna alerta de CPU (el máximo del período es 79 %) y la memoria nunca baja de 78 %. El P90 se adapta a la escala de cada métrica.</w:t>
+              <w:t xml:space="preserve">Con CPU &gt; 80 % no habría ninguna alerta de CPU (el máximo del período es 79 %) y la memoria nunca baja de 78 %. El percentil 90 se adapta a la escala de cada medición.</w:t>
             </w:r>
           </w:p>
         </w:tc>
@@ -7652,7 +8701,7 @@
                 <w:sz w:val="19"/>
                 <w:szCs w:val="19"/>
               </w:rPr>
-              <w:t xml:space="preserve">Nulos rellenados con el último estado válido</w:t>
+              <w:t xml:space="preserve">Completar valores faltantes con el último valor válido</w:t>
             </w:r>
           </w:p>
         </w:tc>
@@ -7710,7 +8759,7 @@
                 <w:sz w:val="19"/>
                 <w:szCs w:val="19"/>
               </w:rPr>
-              <w:t xml:space="preserve">La telemetría cruda no tiene valores faltantes. Sí se descartaron los vectores sin alertas.</w:t>
+              <w:t xml:space="preserve">La telemetría original no tiene valores faltantes. Sí se descartaron los registros sin alertas.</w:t>
             </w:r>
           </w:p>
         </w:tc>
@@ -7799,7 +8848,7 @@
                 <w:sz w:val="19"/>
                 <w:szCs w:val="19"/>
               </w:rPr>
-              <w:t xml:space="preserve">Supera el mínimo de la consigna y da más estabilidad a las métricas.</w:t>
+              <w:t xml:space="preserve">Supera el mínimo de la consigna y hace más estables las mediciones.</w:t>
             </w:r>
           </w:p>
         </w:tc>
@@ -7859,7 +8908,7 @@
                 <w:sz w:val="19"/>
                 <w:szCs w:val="19"/>
               </w:rPr>
-              <w:t xml:space="preserve">Pureza contra el régimen de origen (nominal o estrés)</w:t>
+              <w:t xml:space="preserve">Pureza contra el dataset de origen (normal o estrés)</w:t>
             </w:r>
           </w:p>
         </w:tc>
@@ -7888,7 +8937,7 @@
                 <w:sz w:val="19"/>
                 <w:szCs w:val="19"/>
               </w:rPr>
-              <w:t xml:space="preserve">No existen etiquetas reales de anomalía; el régimen de origen es la mejor etiqueta disponible.</w:t>
+              <w:t xml:space="preserve">No existen etiquetas reales de anomalía; el origen del registro es la mejor referencia disponible.</w:t>
             </w:r>
           </w:p>
         </w:tc>
@@ -7899,7 +8948,7 @@
         <w:pStyle w:val="Heading1"/>
       </w:pPr>
       <w:r>
-        <w:t xml:space="preserve">8. Limitaciones y trabajo futuro</w:t>
+        <w:t xml:space="preserve">9. Limitaciones y trabajo futuro</w:t>
       </w:r>
     </w:p>
     <w:p>
@@ -7912,7 +8961,7 @@
         <w:spacing w:after="60" w:line="276"/>
       </w:pPr>
       <w:r>
-        <w:t xml:space="preserve">La binarización por percentil 90 pierde la intensidad de las métricas. Fuzzy ART o ART-2 permitirían trabajar con valores continuos.</w:t>
+        <w:t xml:space="preserve">Al convertir las mediciones a 0 y 1 se pierde su intensidad: un uso de CPU de 54 % y uno de 79 % valen igual. Las variantes Fuzzy ART o ART-2 permitirían trabajar directamente con valores continuos.</w:t>
       </w:r>
     </w:p>
     <w:p>
@@ -7925,7 +8974,7 @@
         <w:spacing w:after="60" w:line="276"/>
       </w:pPr>
       <w:r>
-        <w:t xml:space="preserve">La etiqueta de régimen se construye con la misma cantidad de alertas que ve la red, así que la pureza mide consistencia y no aciertos frente a incidentes reales.</w:t>
+        <w:t xml:space="preserve">El origen de cada registro (normal o estrés) se definió con la misma cantidad de alertas que ve la red. Por eso la pureza mide la coherencia del agrupamiento, no aciertos frente a incidentes reales del servidor.</w:t>
       </w:r>
     </w:p>
     <w:p>
@@ -7938,7 +8987,7 @@
         <w:spacing w:after="60" w:line="276"/>
       </w:pPr>
       <w:r>
-        <w:t xml:space="preserve">Para reducir la dependencia del orden se podría promediar sobre varios órdenes o adaptar los pesos más lentamente, como sugiere Lippmann.</w:t>
+        <w:t xml:space="preserve">Para reducir la dependencia del orden se podrían combinar los resultados de varios órdenes, o hacer que los pesos se adapten más lentamente, como sugiere Lippmann.</w:t>
       </w:r>
     </w:p>
     <w:p>
@@ -7946,7 +8995,7 @@
         <w:pStyle w:val="Heading1"/>
       </w:pPr>
       <w:r>
-        <w:t xml:space="preserve">9. Conclusiones</w:t>
+        <w:t xml:space="preserve">10. Conclusiones</w:t>
       </w:r>
     </w:p>
     <w:p>
@@ -7955,7 +9004,7 @@
         <w:jc w:val="both"/>
       </w:pPr>
       <w:r>
-        <w:t xml:space="preserve">CarGross.py reproduce el algoritmo del Box 3 de Lippmann y su comportamiento en el ejemplo de letras del artículo. Con los datos de telemetría, la red descubre sin supervisión estados operativos interpretables, resume el régimen de estrés en pocas categorías gracias a la generalización por AND y, con una vigilancia de 0.7, reconoce el régimen de estrés como completamente nuevo respecto de la operación normal. Las limitaciones observadas, la dependencia del orden y la sensibilidad a la elección de ρ, son las que la bibliografía atribuye a este tipo de red.</w:t>
+        <w:t xml:space="preserve">CarGross.py reproduce el algoritmo del Box 3 de Lippmann y su comportamiento en el ejemplo de las letras del artículo. Con los datos de telemetría, la red descubre sin supervisión estados de funcionamiento del servidor que se pueden interpretar, resume el período de estrés en pocos grupos gracias a la generalización del AND y, con una vigilancia de 0.7, reconoce ese período como completamente nuevo respecto del funcionamiento normal. Las limitaciones observadas, la dependencia del orden y la sensibilidad a la elección de ρ, coinciden con las que la bibliografía atribuye a este tipo de red.</w:t>
       </w:r>
     </w:p>
     <w:p>
@@ -7971,7 +9020,7 @@
         <w:pStyle w:val="ListParagraph"/>
         <w:numPr>
           <w:ilvl w:val="0"/>
-          <w:numId w:val="4"/>
+          <w:numId w:val="5"/>
         </w:numPr>
         <w:spacing w:after="60" w:line="276"/>
       </w:pPr>
@@ -7984,7 +9033,7 @@
         <w:pStyle w:val="ListParagraph"/>
         <w:numPr>
           <w:ilvl w:val="0"/>
-          <w:numId w:val="4"/>
+          <w:numId w:val="5"/>
         </w:numPr>
         <w:spacing w:after="60" w:line="276"/>
       </w:pPr>
@@ -7997,7 +9046,7 @@
         <w:pStyle w:val="ListParagraph"/>
         <w:numPr>
           <w:ilvl w:val="0"/>
-          <w:numId w:val="4"/>
+          <w:numId w:val="5"/>
         </w:numPr>
         <w:spacing w:after="60" w:line="276"/>
       </w:pPr>
@@ -8010,7 +9059,7 @@
         <w:pStyle w:val="ListParagraph"/>
         <w:numPr>
           <w:ilvl w:val="0"/>
-          <w:numId w:val="4"/>
+          <w:numId w:val="5"/>
         </w:numPr>
         <w:spacing w:after="60" w:line="276"/>
       </w:pPr>
@@ -8331,7 +9380,7 @@
     </w:lvlOverride>
   </w:num>
   <w:num w:numId="2">
-    <w:abstractNumId w:val="3"/>
+    <w:abstractNumId w:val="4"/>
     <w:lvlOverride w:ilvl="0">
       <w:startOverride w:val="1"/>
     </w:lvlOverride>
@@ -8346,6 +9395,12 @@
     </w:lvlOverride>
   </w:num>
   <w:num w:numId="4">
+    <w:abstractNumId w:val="3"/>
+    <w:lvlOverride w:ilvl="0">
+      <w:startOverride w:val="1"/>
+    </w:lvlOverride>
+  </w:num>
+  <w:num w:numId="5">
     <w:abstractNumId w:val="7"/>
     <w:lvlOverride w:ilvl="0">
       <w:startOverride w:val="1"/>

</xml_diff>

<commit_message>
Manual e informe: vocabulario técnico con aclaraciones; definición y justificación del problema pasan al manual
- Se recupera el vocabulario técnico (régimen, clúster, nodos, patrón,
  instancias, vector nulo, corrida infructuosa) manteniendo las
  explicaciones breves de cada concepto
- Manual: nuevas secciones 1.1 Definición del problema y 1.2
  Justificación de la elección de la red
- Informe: se ciñe al punto 6 de la consigna, remite al manual para la
  definición de anomalía y conserva la tabla de variables

Co-Authored-By: Claude Opus 5.5 <noreply@anthropic.com>
</commit_message>
<xml_diff>
--- a/docs/Informe_de_Corridas_CarGross.docx
+++ b/docs/Informe_de_Corridas_CarGross.docx
@@ -352,7 +352,7 @@
         <w:jc w:val="both"/>
       </w:pPr>
       <w:r>
-        <w:t xml:space="preserve">Este informe presenta las ejecuciones (corridas) de </w:t>
+        <w:t xml:space="preserve">Este informe presenta las corridas de </w:t>
       </w:r>
       <w:r>
         <w:rPr>
@@ -362,7 +362,26 @@
         <w:t xml:space="preserve">CarGross.py</w:t>
       </w:r>
       <w:r>
-        <w:t xml:space="preserve"> con los dos datasets entregados y evalúa sus resultados. Busca responder tres preguntas:</w:t>
+        <w:t xml:space="preserve"> con los dos datasets entregados y evalúa sus resultados. La definición del problema y la justificación de la elección de la red se desarrollan en las secciones 1.1 y 1.2 del Manual de Referencia. Allí, una </w:t>
+      </w:r>
+      <w:r>
+        <w:rPr>
+          <w:b/>
+          <w:bCs/>
+        </w:rPr>
+        <w:t xml:space="preserve">anomalía</w:t>
+      </w:r>
+      <w:r>
+        <w:t xml:space="preserve"> se define de forma operativa como la creación de un clúster nuevo: un comportamiento que la red no logra asimilar a los prototipos aprendidos durante el régimen nominal.</w:t>
+      </w:r>
+    </w:p>
+    <w:p>
+      <w:pPr>
+        <w:spacing w:after="120" w:line="288"/>
+        <w:jc w:val="both"/>
+      </w:pPr>
+      <w:r>
+        <w:t xml:space="preserve">El informe busca responder tres preguntas:</w:t>
       </w:r>
     </w:p>
     <w:p>
@@ -375,7 +394,7 @@
         <w:spacing w:after="60" w:line="276"/>
       </w:pPr>
       <w:r>
-        <w:t xml:space="preserve">¿La red descubre, sin que se le indiquen etiquetas, estados de funcionamiento del servidor que tengan sentido?</w:t>
+        <w:t xml:space="preserve">¿La red descubre, sin etiquetas, estados operativos coherentes del servidor?</w:t>
       </w:r>
     </w:p>
     <w:p>
@@ -388,7 +407,7 @@
         <w:spacing w:after="60" w:line="276"/>
       </w:pPr>
       <w:r>
-        <w:t xml:space="preserve">¿Cómo influyen en el agrupamiento la vigilancia ρ y el orden en que se presentan los datos?</w:t>
+        <w:t xml:space="preserve">¿Cómo influyen en el agrupamiento la vigilancia ρ y el orden de presentación de los patrones?</w:t>
       </w:r>
     </w:p>
     <w:p>
@@ -401,7 +420,7 @@
         <w:spacing w:after="60" w:line="276"/>
       </w:pPr>
       <w:r>
-        <w:t xml:space="preserve">Si la red ya aprendió el funcionamiento normal, ¿reconoce como nuevo un período de estrés? Esta es la definición de anomalía que se planteó en la propuesta.</w:t>
+        <w:t xml:space="preserve">Si la red ya aprendió el régimen nominal, ¿reconoce como nuevo un régimen de estrés?</w:t>
       </w:r>
     </w:p>
     <w:p>
@@ -409,7 +428,7 @@
         <w:pStyle w:val="Heading1"/>
       </w:pPr>
       <w:r>
-        <w:t xml:space="preserve">2. Definición y justificación del problema</w:t>
+        <w:t xml:space="preserve">2. La red y su implementación</w:t>
       </w:r>
     </w:p>
     <w:p>
@@ -417,7 +436,7 @@
         <w:pStyle w:val="Heading2"/>
       </w:pPr>
       <w:r>
-        <w:t xml:space="preserve">2.1 Definición de la tarea</w:t>
+        <w:t xml:space="preserve">2.1 Algoritmo</w:t>
       </w:r>
     </w:p>
     <w:p>
@@ -426,44 +445,46 @@
         <w:jc w:val="both"/>
       </w:pPr>
       <w:r>
-        <w:t xml:space="preserve">El trabajo consiste en aplicar la red de Carpenter/Grossberg para agrupar, sin supervisión, los estados de funcionamiento de un servidor a partir de su telemetría, es decir, de mediciones periódicas de uso de CPU, memoria, disco y red. Que el agrupamiento sea </w:t>
+        <w:t xml:space="preserve">La red tiene dos capas: la capa de entrada </w:t>
       </w:r>
       <w:r>
         <w:rPr>
           <w:b/>
           <w:bCs/>
         </w:rPr>
-        <w:t xml:space="preserve">no supervisado</w:t>
-      </w:r>
-      <w:r>
-        <w:t xml:space="preserve"> significa que la red no recibe etiquetas como "normal" o "falla": forma los grupos solo a partir del parecido entre los perfiles de telemetría.</w:t>
-      </w:r>
-    </w:p>
-    <w:p>
-      <w:pPr>
-        <w:spacing w:after="120" w:line="288"/>
-        <w:jc w:val="both"/>
-      </w:pPr>
-      <w:r>
-        <w:t xml:space="preserve">Una </w:t>
+        <w:t xml:space="preserve">F1</w:t>
+      </w:r>
+      <w:r>
+        <w:t xml:space="preserve">, con un nodo por variable, y la capa de salida </w:t>
       </w:r>
       <w:r>
         <w:rPr>
           <w:b/>
           <w:bCs/>
         </w:rPr>
-        <w:t xml:space="preserve">anomalía</w:t>
-      </w:r>
-      <w:r>
-        <w:t xml:space="preserve"> se define de forma operativa: es un comportamiento del servidor que la red no logra asociar a ninguno de los grupos aprendidos durante el funcionamiento normal, y que por eso la lleva a crear un grupo nuevo.</w:t>
-      </w:r>
-    </w:p>
-    <w:p>
-      <w:pPr>
-        <w:pStyle w:val="Heading2"/>
-      </w:pPr>
-      <w:r>
-        <w:t xml:space="preserve">2.2 Justificación de la elección de la red</w:t>
+        <w:t xml:space="preserve">F2</w:t>
+      </w:r>
+      <w:r>
+        <w:t xml:space="preserve">, con un nodo por categoría (clúster). Cada categoría se representa con un </w:t>
+      </w:r>
+      <w:r>
+        <w:rPr>
+          <w:b/>
+          <w:bCs/>
+        </w:rPr>
+        <w:t xml:space="preserve">prototipo</w:t>
+      </w:r>
+      <w:r>
+        <w:t xml:space="preserve">: un patrón binario que resume a los patrones del clúster y que se guarda en los pesos descendentes (*top-down*, t), que van de F2 a F1. Los pesos ascendentes (*bottom-up*, b), que van de F1 a F2, determinan qué nodo compite primero.</w:t>
+      </w:r>
+    </w:p>
+    <w:p>
+      <w:pPr>
+        <w:spacing w:after="120" w:line="288"/>
+        <w:jc w:val="both"/>
+      </w:pPr>
+      <w:r>
+        <w:t xml:space="preserve">La implementación sigue el algoritmo del Box 3 de Lippmann (1987). Para cada patrón binario X de N componentes:</w:t>
       </w:r>
     </w:p>
     <w:p>
@@ -480,10 +501,10 @@
           <w:b/>
           <w:bCs/>
         </w:rPr>
-        <w:t xml:space="preserve">Aprende de forma continua:</w:t>
-      </w:r>
-      <w:r>
-        <w:t xml:space="preserve"> según Lippmann (1987), la red implementa el algoritmo del líder, en el que cada dato nuevo se compara con los grupos existentes y, si no se parece a ninguno, inicia un grupo propio. Esto le permite seguir aprendiendo mientras recibe datos, algo importante en infraestructura informática, donde aparecen continuamente nuevos tipos de fallas o de carga.</w:t>
+        <w:t xml:space="preserve">Inicialización:</w:t>
+      </w:r>
+      <w:r>
+        <w:t xml:space="preserve"> cada nodo de salida j arranca libre (no comprometido con ninguna categoría), con pesos t_ij = 1 y b_ij = 1/(1+N).</w:t>
       </w:r>
     </w:p>
     <w:p>
@@ -500,10 +521,10 @@
           <w:b/>
           <w:bCs/>
         </w:rPr>
-        <w:t xml:space="preserve">No hay que fijar de antemano la cantidad de grupos:</w:t>
-      </w:r>
-      <w:r>
-        <w:t xml:space="preserve"> la red crea tantas categorías como el comportamiento del servidor requiera, según la vigilancia elegida.</w:t>
+        <w:t xml:space="preserve">Puntaje de coincidencia:</w:t>
+      </w:r>
+      <w:r>
+        <w:t xml:space="preserve"> μ_j = Σ b_ij · x_i para todos los nodos, comprometidos o libres; es la suma de los pesos ascendentes en las posiciones donde el patrón tiene un 1.</w:t>
       </w:r>
     </w:p>
     <w:p>
@@ -520,10 +541,10 @@
           <w:b/>
           <w:bCs/>
         </w:rPr>
-        <w:t xml:space="preserve">No supone una distribución estadística:</w:t>
-      </w:r>
-      <w:r>
-        <w:t xml:space="preserve"> no parte de suposiciones sobre la forma de los datos de telemetría; solo compara patrones de 0 y 1.</w:t>
+        <w:t xml:space="preserve">Ganador:</w:t>
+      </w:r>
+      <w:r>
+        <w:t xml:space="preserve"> el nodo de mayor μ_j. En la red, esto ocurre por inhibición lateral: los nodos de F2 compiten y se inhiben entre sí hasta que queda uno solo activo.</w:t>
       </w:r>
     </w:p>
     <w:p>
@@ -540,10 +561,10 @@
           <w:b/>
           <w:bCs/>
         </w:rPr>
-        <w:t xml:space="preserve">Lo nuevo no borra lo aprendido:</w:t>
-      </w:r>
-      <w:r>
-        <w:t xml:space="preserve"> la red solo modifica un grupo cuando el dato nuevo se le parece lo suficiente. Un comportamiento distinto genera un grupo nuevo en lugar de alterar los existentes.</w:t>
+        <w:t xml:space="preserve">Test de vigilancia:</w:t>
+      </w:r>
+      <w:r>
+        <w:t xml:space="preserve"> se calcula ‖T·X‖ / ‖X‖, es decir, la cantidad de unos del patrón que también están en el prototipo del ganador, dividida por la cantidad total de unos del patrón. Si ese valor supera ρ, el patrón se asigna al ganador.</w:t>
       </w:r>
     </w:p>
     <w:p>
@@ -560,74 +581,38 @@
           <w:b/>
           <w:bCs/>
         </w:rPr>
-        <w:t xml:space="preserve">La binarización actúa como primer filtro:</w:t>
-      </w:r>
-      <w:r>
-        <w:t xml:space="preserve"> como la red trabaja con 0 y 1, cada métrica se convierte en una alerta que vale 1 solo cuando la medición es alta. Así se dejan de lado las variaciones menores y se conservan los estados críticos.</w:t>
-      </w:r>
-    </w:p>
-    <w:p>
-      <w:pPr>
-        <w:pStyle w:val="Heading1"/>
-      </w:pPr>
-      <w:r>
-        <w:t xml:space="preserve">3. La red y su implementación</w:t>
-      </w:r>
-    </w:p>
-    <w:p>
-      <w:pPr>
-        <w:pStyle w:val="Heading2"/>
-      </w:pPr>
-      <w:r>
-        <w:t xml:space="preserve">3.1 Algoritmo</w:t>
-      </w:r>
-    </w:p>
-    <w:p>
-      <w:pPr>
-        <w:spacing w:after="120" w:line="288"/>
-        <w:jc w:val="both"/>
-      </w:pPr>
-      <w:r>
-        <w:t xml:space="preserve">La red tiene dos capas de neuronas: la capa de entrada, llamada </w:t>
-      </w:r>
+        <w:t xml:space="preserve">Adaptación:</w:t>
+      </w:r>
+      <w:r>
+        <w:t xml:space="preserve"> el prototipo se actualiza con un AND lógico (t_ij ← t_ij · x_i), que conserva un 1 solo donde el prototipo y el patrón tienen 1, y b_ij ← t_ij · x_i / (0.5 + Σ t_ij · x_i).</w:t>
+      </w:r>
+    </w:p>
+    <w:p>
+      <w:pPr>
+        <w:pStyle w:val="ListParagraph"/>
+        <w:numPr>
+          <w:ilvl w:val="0"/>
+          <w:numId w:val="3"/>
+        </w:numPr>
+        <w:spacing w:after="60" w:line="276"/>
+      </w:pPr>
       <w:r>
         <w:rPr>
           <w:b/>
           <w:bCs/>
         </w:rPr>
-        <w:t xml:space="preserve">F1</w:t>
-      </w:r>
-      <w:r>
-        <w:t xml:space="preserve">, con una neurona por variable, y la capa de salida, llamada </w:t>
-      </w:r>
-      <w:r>
-        <w:rPr>
-          <w:b/>
-          <w:bCs/>
-        </w:rPr>
-        <w:t xml:space="preserve">F2</w:t>
-      </w:r>
-      <w:r>
-        <w:t xml:space="preserve">, con una neurona por grupo o categoría. Cada grupo se representa con un </w:t>
-      </w:r>
-      <w:r>
-        <w:rPr>
-          <w:b/>
-          <w:bCs/>
-        </w:rPr>
-        <w:t xml:space="preserve">prototipo</w:t>
-      </w:r>
-      <w:r>
-        <w:t xml:space="preserve">: un patrón de 0 y 1 que resume a los registros del grupo y que se guarda en los pesos que van de F2 a F1 (pesos descendentes o *top-down*, t). Los pesos que van de F1 a F2 (pesos ascendentes o *bottom-up*, b) sirven para elegir qué grupo compite primero.</w:t>
-      </w:r>
-    </w:p>
-    <w:p>
-      <w:pPr>
-        <w:spacing w:after="120" w:line="288"/>
-        <w:jc w:val="both"/>
-      </w:pPr>
-      <w:r>
-        <w:t xml:space="preserve">La implementación sigue el algoritmo del Box 3 de Lippmann (1987). Para cada registro X de N valores:</w:t>
+        <w:t xml:space="preserve">Reset:</w:t>
+      </w:r>
+      <w:r>
+        <w:t xml:space="preserve"> si no se supera el test, el ganador se inhabilita para ese patrón y se vuelve al paso 3. Cuando gana un nodo libre, se crea una categoría nueva.</w:t>
+      </w:r>
+    </w:p>
+    <w:p>
+      <w:pPr>
+        <w:pStyle w:val="Heading2"/>
+      </w:pPr>
+      <w:r>
+        <w:t xml:space="preserve">2.2 Verificación de la implementación</w:t>
       </w:r>
     </w:p>
     <w:p>
@@ -644,10 +629,10 @@
           <w:b/>
           <w:bCs/>
         </w:rPr>
-        <w:t xml:space="preserve">Inicialización:</w:t>
-      </w:r>
-      <w:r>
-        <w:t xml:space="preserve"> todas las neuronas de salida empiezan libres, con pesos t = 1 y b = 1/(1+N).</w:t>
+        <w:t xml:space="preserve">Ejemplo de Lippmann (Fig. 11):</w:t>
+      </w:r>
+      <w:r>
+        <w:t xml:space="preserve"> con letras C, E y F de 5 × 5 píxeles, ρ = 0.9 produce tres ejemplares. Con una vigilancia menor, C y E se fusionan en un ejemplar idéntico a C. Una F con un píxel faltante se acepta y degrada el ejemplar F por el AND. Es el mismo comportamiento que describe el artículo.</w:t>
       </w:r>
     </w:p>
     <w:p>
@@ -664,10 +649,10 @@
           <w:b/>
           <w:bCs/>
         </w:rPr>
-        <w:t xml:space="preserve">Puntaje de coincidencia:</w:t>
-      </w:r>
-      <w:r>
-        <w:t xml:space="preserve"> cada neurona de salida calcula μ_j = Σ b_ij · x_i, es decir, la suma de sus pesos ascendentes en las posiciones donde el registro tiene un 1.</w:t>
+        <w:t xml:space="preserve">Equivalencia con el Box 3 literal:</w:t>
+      </w:r>
+      <w:r>
+        <w:t xml:space="preserve"> una implementación literal del Box 3, con M nodos inicializados y compitiendo desde el principio, produce las mismas asignaciones que CarGross.py en los dos datasets y en 100 conjuntos aleatorios, para distintos valores de ρ y de M.</w:t>
       </w:r>
     </w:p>
     <w:p>
@@ -684,10 +669,10 @@
           <w:b/>
           <w:bCs/>
         </w:rPr>
-        <w:t xml:space="preserve">Elección de la ganadora:</w:t>
-      </w:r>
-      <w:r>
-        <w:t xml:space="preserve"> gana la neurona con mayor puntaje. En la red real esto ocurre por inhibición lateral: las neuronas de F2 compiten y se apagan entre sí hasta que queda una sola activa.</w:t>
+        <w:t xml:space="preserve">Corrección respecto de la versión anterior:</w:t>
+      </w:r>
+      <w:r>
+        <w:t xml:space="preserve"> la primera versión creaba los nodos solo cuando ningún nodo existente pasaba el test, sin dejar competir a los nodos libres desde el inicio como indica el Box 3. Con el dataset de estrés y ρ = 0.3, eso producía clústeres de 27 y 73 instancias en lugar de los 21 y 79 del Box 3. La versión actual corrige esa diferencia.</w:t>
       </w:r>
     </w:p>
     <w:p>
@@ -700,135 +685,7 @@
         <w:spacing w:after="60" w:line="276"/>
       </w:pPr>
       <w:r>
-        <w:rPr>
-          <w:b/>
-          <w:bCs/>
-        </w:rPr>
-        <w:t xml:space="preserve">Test de vigilancia:</w:t>
-      </w:r>
-      <w:r>
-        <w:t xml:space="preserve"> se calcula ‖T·X‖ / ‖X‖, que es la cantidad de unos del registro que también están en el prototipo de la ganadora, dividida por la cantidad total de unos del registro. Si ese valor supera ρ, el registro se asigna a la ganadora.</w:t>
-      </w:r>
-    </w:p>
-    <w:p>
-      <w:pPr>
-        <w:pStyle w:val="ListParagraph"/>
-        <w:numPr>
-          <w:ilvl w:val="0"/>
-          <w:numId w:val="4"/>
-        </w:numPr>
-        <w:spacing w:after="60" w:line="276"/>
-      </w:pPr>
-      <w:r>
-        <w:rPr>
-          <w:b/>
-          <w:bCs/>
-        </w:rPr>
-        <w:t xml:space="preserve">Aprendizaje:</w:t>
-      </w:r>
-      <w:r>
-        <w:t xml:space="preserve"> el prototipo se actualiza con un AND lógico (t_ij ← t_ij · x_i): conserva un 1 solo donde el prototipo y el registro tienen 1. Los pesos ascendentes se recalculan como b_ij = t_ij · x_i / (0.5 + Σ t_ij · x_i).</w:t>
-      </w:r>
-    </w:p>
-    <w:p>
-      <w:pPr>
-        <w:pStyle w:val="ListParagraph"/>
-        <w:numPr>
-          <w:ilvl w:val="0"/>
-          <w:numId w:val="4"/>
-        </w:numPr>
-        <w:spacing w:after="60" w:line="276"/>
-      </w:pPr>
-      <w:r>
-        <w:rPr>
-          <w:b/>
-          <w:bCs/>
-        </w:rPr>
-        <w:t xml:space="preserve">Reset:</w:t>
-      </w:r>
-      <w:r>
-        <w:t xml:space="preserve"> si no se supera el test, la ganadora queda descartada para ese registro y se vuelve al paso 3 con las restantes. Cuando gana una neurona libre, se crea un grupo nuevo.</w:t>
-      </w:r>
-    </w:p>
-    <w:p>
-      <w:pPr>
-        <w:pStyle w:val="Heading2"/>
-      </w:pPr>
-      <w:r>
-        <w:t xml:space="preserve">3.2 Verificación de la implementación</w:t>
-      </w:r>
-    </w:p>
-    <w:p>
-      <w:pPr>
-        <w:pStyle w:val="ListParagraph"/>
-        <w:numPr>
-          <w:ilvl w:val="0"/>
-          <w:numId w:val="3"/>
-        </w:numPr>
-        <w:spacing w:after="60" w:line="276"/>
-      </w:pPr>
-      <w:r>
-        <w:rPr>
-          <w:b/>
-          <w:bCs/>
-        </w:rPr>
-        <w:t xml:space="preserve">Ejemplo de Lippmann (Fig. 11):</w:t>
-      </w:r>
-      <w:r>
-        <w:t xml:space="preserve"> se reprodujo con letras C, E y F dibujadas en grillas de 5 × 5. Con ρ = 0.9 la red crea un grupo por letra. Con una vigilancia menor, C y E quedan en el mismo grupo y su prototipo resulta igual a la C. Una F a la que le falta un píxel se acepta como F y, por el AND, borra ese píxel del prototipo. Es el mismo comportamiento que describe el artículo.</w:t>
-      </w:r>
-    </w:p>
-    <w:p>
-      <w:pPr>
-        <w:pStyle w:val="ListParagraph"/>
-        <w:numPr>
-          <w:ilvl w:val="0"/>
-          <w:numId w:val="3"/>
-        </w:numPr>
-        <w:spacing w:after="60" w:line="276"/>
-      </w:pPr>
-      <w:r>
-        <w:rPr>
-          <w:b/>
-          <w:bCs/>
-        </w:rPr>
-        <w:t xml:space="preserve">Comparación con el Box 3 tal cual está escrito:</w:t>
-      </w:r>
-      <w:r>
-        <w:t xml:space="preserve"> se programó también una versión literal del Box 3, con todas las neuronas inicializadas y compitiendo desde el principio. Produce exactamente las mismas asignaciones que CarGross.py en los dos datasets y en 100 conjuntos de datos generados al azar, con distintos valores de ρ y de cantidad de neuronas.</w:t>
-      </w:r>
-    </w:p>
-    <w:p>
-      <w:pPr>
-        <w:pStyle w:val="ListParagraph"/>
-        <w:numPr>
-          <w:ilvl w:val="0"/>
-          <w:numId w:val="3"/>
-        </w:numPr>
-        <w:spacing w:after="60" w:line="276"/>
-      </w:pPr>
-      <w:r>
-        <w:rPr>
-          <w:b/>
-          <w:bCs/>
-        </w:rPr>
-        <w:t xml:space="preserve">Corrección respecto de la versión anterior:</w:t>
-      </w:r>
-      <w:r>
-        <w:t xml:space="preserve"> la primera versión del programa solo creaba un grupo nuevo cuando ningún grupo existente pasaba el test, sin dejar que las neuronas libres compitieran desde el inicio como indica el Box 3. Con el dataset de estrés y ρ = 0.3, eso producía grupos de 27 y 73 registros en lugar de los 21 y 79 que da el Box 3. La versión actual corrige esa diferencia.</w:t>
-      </w:r>
-    </w:p>
-    <w:p>
-      <w:pPr>
-        <w:pStyle w:val="ListParagraph"/>
-        <w:numPr>
-          <w:ilvl w:val="0"/>
-          <w:numId w:val="3"/>
-        </w:numPr>
-        <w:spacing w:after="60" w:line="276"/>
-      </w:pPr>
-      <w:r>
-        <w:t xml:space="preserve">Las 16 pruebas automáticas se ejecutan con </w:t>
+        <w:t xml:space="preserve">El conjunto completo de 16 pruebas automáticas se ejecuta con </w:t>
       </w:r>
       <w:r>
         <w:rPr>
@@ -847,7 +704,7 @@
         <w:pStyle w:val="Heading1"/>
       </w:pPr>
       <w:r>
-        <w:t xml:space="preserve">4. Datos</w:t>
+        <w:t xml:space="preserve">3. Datos</w:t>
       </w:r>
     </w:p>
     <w:p>
@@ -856,7 +713,7 @@
         <w:jc w:val="both"/>
       </w:pPr>
       <w:r>
-        <w:t xml:space="preserve">Los datos provienen de la telemetría de un servidor: 2243 registros tomados cada 300 segundos (5 minutos) durante 8 días, con 5 mediciones continuas: CPU, memoria, uso de disco, tráfico de red entrante y tráfico de red saliente. El script </w:t>
+        <w:t xml:space="preserve">La fuente es la telemetría de un servidor: 2243 registros tomados cada 300 segundos (5 minutos) durante 8 días, con 5 métricas continuas: CPU, memoria, E/S de disco, red entrante y red saliente. </w:t>
       </w:r>
       <w:r>
         <w:rPr>
@@ -867,7 +724,7 @@
         <w:t xml:space="preserve">preprocesamiento_art1.py</w:t>
       </w:r>
       <w:r>
-        <w:t xml:space="preserve"> convierte cada medición en una variable de 0 y 1 usando su </w:t>
+        <w:t xml:space="preserve"> binariza cada métrica con su </w:t>
       </w:r>
       <w:r>
         <w:rPr>
@@ -877,7 +734,7 @@
         <w:t xml:space="preserve">percentil 90</w:t>
       </w:r>
       <w:r>
-        <w:t xml:space="preserve">, que es el valor que solo supera el 10 % más alto de las mediciones del período. La variable vale 1 cuando la medición está por encima de ese valor:</w:t>
+        <w:t xml:space="preserve"> en todo el período, es decir, el valor que solo supera el 10 % más alto de las mediciones. La variable vale 1 cuando la métrica está por encima de ese umbral:</w:t>
       </w:r>
     </w:p>
     <w:tbl>
@@ -930,7 +787,7 @@
                 <w:sz w:val="19"/>
                 <w:szCs w:val="19"/>
               </w:rPr>
-              <w:t xml:space="preserve">Variable</w:t>
+              <w:t xml:space="preserve">Variable binaria</w:t>
             </w:r>
           </w:p>
         </w:tc>
@@ -962,7 +819,7 @@
                 <w:sz w:val="19"/>
                 <w:szCs w:val="19"/>
               </w:rPr>
-              <w:t xml:space="preserve">Medición original</w:t>
+              <w:t xml:space="preserve">Métrica cruda</w:t>
             </w:r>
           </w:p>
         </w:tc>
@@ -1386,7 +1243,7 @@
                 <w:sz w:val="19"/>
                 <w:szCs w:val="19"/>
               </w:rPr>
-              <w:t xml:space="preserve">Uso de disco alto</w:t>
+              <w:t xml:space="preserve">E/S de disco alta</w:t>
             </w:r>
           </w:p>
         </w:tc>
@@ -1657,12 +1514,12 @@
         <w:pStyle w:val="ListParagraph"/>
         <w:numPr>
           <w:ilvl w:val="0"/>
-          <w:numId w:val="3"/>
+          <w:numId w:val="4"/>
         </w:numPr>
         <w:spacing w:after="60" w:line="276"/>
       </w:pPr>
       <w:r>
-        <w:t xml:space="preserve">1634 registros (72.85 %) no tienen ninguna alerta y se descartan, porque la red no puede procesar registros con todos los valores en 0 (el test de vigilancia dividiría por cero).</w:t>
+        <w:t xml:space="preserve">1634 registros (72.85 %) no tienen ninguna alerta y se descartan, porque el vector nulo no puede procesarse (el test de vigilancia dividiría por cero).</w:t>
       </w:r>
     </w:p>
     <w:p>
@@ -1670,12 +1527,12 @@
         <w:pStyle w:val="ListParagraph"/>
         <w:numPr>
           <w:ilvl w:val="0"/>
-          <w:numId w:val="3"/>
+          <w:numId w:val="4"/>
         </w:numPr>
         <w:spacing w:after="60" w:line="276"/>
       </w:pPr>
       <w:r>
-        <w:t xml:space="preserve">Quedan 609 registros con al menos una alerta: 463 con 1 o 2 alertas al mismo tiempo y 146 con 3 o más.</w:t>
+        <w:t xml:space="preserve">Quedan 609 registros con actividad: 463 con 1 o 2 alertas simultáneas y 146 con 3 o más.</w:t>
       </w:r>
     </w:p>
     <w:p>
@@ -1683,7 +1540,7 @@
         <w:pStyle w:val="ListParagraph"/>
         <w:numPr>
           <w:ilvl w:val="0"/>
-          <w:numId w:val="3"/>
+          <w:numId w:val="4"/>
         </w:numPr>
         <w:spacing w:after="60" w:line="276"/>
       </w:pPr>
@@ -1692,10 +1549,10 @@
           <w:b/>
           <w:bCs/>
         </w:rPr>
-        <w:t xml:space="preserve">Dataset 1, funcionamiento normal (nominal):</w:t>
-      </w:r>
-      <w:r>
-        <w:t xml:space="preserve"> 100 de los 463 registros con 1 o 2 alertas, elegidos al azar y ordenados en el tiempo. Se usó una semilla fija (42), un número que hace que la elección al azar sea siempre la misma, para que el dataset se pueda volver a generar idéntico.</w:t>
+        <w:t xml:space="preserve">Dataset 1, régimen nominal:</w:t>
+      </w:r>
+      <w:r>
+        <w:t xml:space="preserve"> 100 de los 463 registros con 1 o 2 alertas, elegidos al azar y en orden temporal. Se usó una semilla fija (42), un número que hace que la elección al azar sea siempre la misma, para que el dataset se pueda regenerar idéntico.</w:t>
       </w:r>
     </w:p>
     <w:p>
@@ -1703,7 +1560,7 @@
         <w:pStyle w:val="ListParagraph"/>
         <w:numPr>
           <w:ilvl w:val="0"/>
-          <w:numId w:val="3"/>
+          <w:numId w:val="4"/>
         </w:numPr>
         <w:spacing w:after="60" w:line="276"/>
       </w:pPr>
@@ -1712,7 +1569,7 @@
           <w:b/>
           <w:bCs/>
         </w:rPr>
-        <w:t xml:space="preserve">Dataset 2, funcionamiento bajo estrés:</w:t>
+        <w:t xml:space="preserve">Dataset 2, régimen de estrés:</w:t>
       </w:r>
       <w:r>
         <w:t xml:space="preserve"> los primeros 100 registros con 3 o más alertas.</w:t>
@@ -1723,12 +1580,12 @@
         <w:pStyle w:val="ListParagraph"/>
         <w:numPr>
           <w:ilvl w:val="0"/>
-          <w:numId w:val="3"/>
+          <w:numId w:val="4"/>
         </w:numPr>
         <w:spacing w:after="60" w:line="276"/>
       </w:pPr>
       <w:r>
-        <w:t xml:space="preserve">Los dos datasets no tienen registros en común, y en ambos las 5 variables toman los valores 0 y 1.</w:t>
+        <w:t xml:space="preserve">Los datasets no comparten registros y en los dos varían las 5 variables.</w:t>
       </w:r>
     </w:p>
     <w:p>
@@ -1737,7 +1594,7 @@
         <w:jc w:val="both"/>
       </w:pPr>
       <w:r>
-        <w:t xml:space="preserve">Combinaciones de alertas presentes en cada dataset (el orden de los valores es: cpu_alta, ram_alta, disco_saturado, red_in_alta, red_out_alta):</w:t>
+        <w:t xml:space="preserve">Combinaciones presentes en cada dataset (orden: cpu_alta, ram_alta, disco_saturado, red_in_alta, red_out_alta):</w:t>
       </w:r>
     </w:p>
     <w:p>
@@ -1745,7 +1602,7 @@
         <w:pStyle w:val="Heading3"/>
       </w:pPr>
       <w:r>
-        <w:t xml:space="preserve">Dataset 1: funcionamiento normal</w:t>
+        <w:t xml:space="preserve">Dataset 1: régimen nominal</w:t>
       </w:r>
     </w:p>
     <w:tbl>
@@ -1797,7 +1654,7 @@
                 <w:sz w:val="19"/>
                 <w:szCs w:val="19"/>
               </w:rPr>
-              <w:t xml:space="preserve">Combinación</w:t>
+              <w:t xml:space="preserve">Patrón</w:t>
             </w:r>
           </w:p>
         </w:tc>
@@ -2584,7 +2441,7 @@
         <w:pStyle w:val="Heading3"/>
       </w:pPr>
       <w:r>
-        <w:t xml:space="preserve">Dataset 2: funcionamiento bajo estrés</w:t>
+        <w:t xml:space="preserve">Dataset 2: régimen de estrés</w:t>
       </w:r>
     </w:p>
     <w:tbl>
@@ -2636,7 +2493,7 @@
                 <w:sz w:val="19"/>
                 <w:szCs w:val="19"/>
               </w:rPr>
-              <w:t xml:space="preserve">Combinación</w:t>
+              <w:t xml:space="preserve">Patrón</w:t>
             </w:r>
           </w:p>
         </w:tc>
@@ -3429,7 +3286,7 @@
         <w:jc w:val="both"/>
       </w:pPr>
       <w:r>
-        <w:t xml:space="preserve">En los dos casos, el tráfico de red entrante y el saliente aparecen casi siempre juntos. La única excepción es un registro del dataset normal con la combinación [0, 0, 1, 0, 1].</w:t>
+        <w:t xml:space="preserve">En ambos regímenes la red entrante y la saliente aparecen casi siempre juntas: en el nominal, la única excepción es un registro [0, 0, 1, 0, 1].</w:t>
       </w:r>
     </w:p>
     <w:p>
@@ -3437,7 +3294,7 @@
         <w:pStyle w:val="Heading1"/>
       </w:pPr>
       <w:r>
-        <w:t xml:space="preserve">5. Metodología</w:t>
+        <w:t xml:space="preserve">4. Metodología</w:t>
       </w:r>
     </w:p>
     <w:p>
@@ -3446,7 +3303,7 @@
         <w:jc w:val="both"/>
       </w:pPr>
       <w:r>
-        <w:t xml:space="preserve">Todas las corridas se hicieron con Python 3.12. Son deterministas: con los mismos datos y parámetros dan siempre el mismo resultado. Se reproducen con:</w:t>
+        <w:t xml:space="preserve">Todas las corridas se hicieron con Python 3.12 y son deterministas: con los mismos datos y parámetros dan siempre el mismo resultado. Se reproducen con:</w:t>
       </w:r>
     </w:p>
     <w:p>
@@ -3681,7 +3538,7 @@
                 <w:sz w:val="19"/>
                 <w:szCs w:val="19"/>
               </w:rPr>
-              <w:t xml:space="preserve">Cantidad de grupos (M), tamaño de cada grupo y prototipos, para ρ = 0.1, 0.3, 0.5, 0.7 y 0.9</w:t>
+              <w:t xml:space="preserve">M (cantidad de categorías), tamaños y prototipos para ρ = 0.1, 0.3, 0.5, 0.7 y 0.9</w:t>
             </w:r>
           </w:p>
         </w:tc>
@@ -3771,7 +3628,7 @@
                 <w:sz w:val="19"/>
                 <w:szCs w:val="19"/>
               </w:rPr>
-              <w:t xml:space="preserve">Cuántos grupos hay a medida que se presentan los registros (ρ = 0.5)</w:t>
+              <w:t xml:space="preserve">Categorías acumuladas a medida que se presentan los patrones (ρ = 0.5)</w:t>
             </w:r>
           </w:p>
         </w:tc>
@@ -3861,7 +3718,7 @@
                 <w:sz w:val="19"/>
                 <w:szCs w:val="19"/>
               </w:rPr>
-              <w:t xml:space="preserve">M y tamaño de los grupos con 20 órdenes al azar (semillas 0 a 19), para ρ = 0.3 y 0.5</w:t>
+              <w:t xml:space="preserve">M y tamaños con 20 órdenes aleatorios (semillas 0 a 19), ρ = 0.3 y 0.5</w:t>
             </w:r>
           </w:p>
         </w:tc>
@@ -3922,7 +3779,7 @@
                 <w:sz w:val="19"/>
                 <w:szCs w:val="19"/>
               </w:rPr>
-              <w:t xml:space="preserve">4. Normal y luego estrés</w:t>
+              <w:t xml:space="preserve">4. Base y luego estrés</w:t>
             </w:r>
           </w:p>
         </w:tc>
@@ -3951,7 +3808,7 @@
                 <w:sz w:val="19"/>
                 <w:szCs w:val="19"/>
               </w:rPr>
-              <w:t xml:space="preserve">Pureza de los grupos y cantidad de registros de estrés que quedan en grupos del funcionamiento normal</w:t>
+              <w:t xml:space="preserve">Pureza respecto del régimen de origen y patrones de estrés absorbidos por categorías nominales</w:t>
             </w:r>
           </w:p>
         </w:tc>
@@ -3998,7 +3855,7 @@
         <w:jc w:val="both"/>
       </w:pPr>
       <w:r>
-        <w:t xml:space="preserve">Como no hay etiquetas reales de anomalía, la </w:t>
+        <w:t xml:space="preserve">Como no existen etiquetas reales de anomalía, la </w:t>
       </w:r>
       <w:r>
         <w:rPr>
@@ -4008,7 +3865,7 @@
         <w:t xml:space="preserve">pureza</w:t>
       </w:r>
       <w:r>
-        <w:t xml:space="preserve"> se mide contra el dataset de origen de cada registro (normal o estrés). Para cada grupo se cuenta cuántos registros pertenecen al origen más frecuente dentro del grupo; esos conteos se suman y se dividen por el total de registros. Una pureza de 1 significa que ningún grupo mezcla registros de los dos orígenes.</w:t>
+        <w:t xml:space="preserve"> se mide contra el régimen de origen de cada registro (nominal o estrés). Para cada clúster se cuenta cuántas instancias pertenecen a su régimen mayoritario; esos conteos se suman y se dividen por el total de registros. Una pureza de 1 significa que ningún clúster mezcla registros de los dos regímenes.</w:t>
       </w:r>
     </w:p>
     <w:p>
@@ -4016,7 +3873,7 @@
         <w:pStyle w:val="Heading1"/>
       </w:pPr>
       <w:r>
-        <w:t xml:space="preserve">6. Resultados</w:t>
+        <w:t xml:space="preserve">5. Resultados</w:t>
       </w:r>
     </w:p>
     <w:p>
@@ -4024,7 +3881,7 @@
         <w:pStyle w:val="Heading2"/>
       </w:pPr>
       <w:r>
-        <w:t xml:space="preserve">6.1 Sensibilidad a la vigilancia</w:t>
+        <w:t xml:space="preserve">5.1 Sensibilidad a la vigilancia</w:t>
       </w:r>
     </w:p>
     <w:p>
@@ -4033,7 +3890,7 @@
         <w:jc w:val="both"/>
       </w:pPr>
       <w:r>
-        <w:t xml:space="preserve">La tabla muestra la cantidad de grupos (M) y la cantidad de registros de cada grupo, en el orden en que la red los creó:</w:t>
+        <w:t xml:space="preserve">La tabla muestra la cantidad de categorías (M) y el tamaño de cada clúster, en el orden en que la red los creó:</w:t>
       </w:r>
     </w:p>
     <w:tbl>
@@ -4119,7 +3976,7 @@
                 <w:sz w:val="19"/>
                 <w:szCs w:val="19"/>
               </w:rPr>
-              <w:t xml:space="preserve">M normal</w:t>
+              <w:t xml:space="preserve">M nominal</w:t>
             </w:r>
           </w:p>
         </w:tc>
@@ -4151,7 +4008,7 @@
                 <w:sz w:val="19"/>
                 <w:szCs w:val="19"/>
               </w:rPr>
-              <w:t xml:space="preserve">Tamaños (normal)</w:t>
+              <w:t xml:space="preserve">Tamaños (nominal)</w:t>
             </w:r>
           </w:p>
         </w:tc>
@@ -5020,7 +4877,7 @@
           <w:sz w:val="18"/>
           <w:szCs w:val="18"/>
         </w:rPr>
-        <w:t xml:space="preserve">Figura 1. Cantidad de grupos formados (M) según la vigilancia ρ en cada dataset.</w:t>
+        <w:t xml:space="preserve">Figura 1. Categorías formadas (M) según la vigilancia ρ en cada dataset.</w:t>
       </w:r>
     </w:p>
     <w:p>
@@ -5029,7 +4886,7 @@
         <w:jc w:val="both"/>
       </w:pPr>
       <w:r>
-        <w:t xml:space="preserve">Prototipos aprendidos con ρ = 0.5 (es la salida del test demo del manual):</w:t>
+        <w:t xml:space="preserve">Prototipos aprendidos con ρ = 0.5 (salida del test demo del manual):</w:t>
       </w:r>
     </w:p>
     <w:p>
@@ -5037,7 +4894,7 @@
         <w:pStyle w:val="Heading3"/>
       </w:pPr>
       <w:r>
-        <w:t xml:space="preserve">Funcionamiento normal, ρ = 0.5</w:t>
+        <w:t xml:space="preserve">Régimen nominal, ρ = 0.5</w:t>
       </w:r>
     </w:p>
     <w:tbl>
@@ -5089,7 +4946,7 @@
                 <w:sz w:val="19"/>
                 <w:szCs w:val="19"/>
               </w:rPr>
-              <w:t xml:space="preserve">Grupo (nodo F2)</w:t>
+              <w:t xml:space="preserve">Nodo F2</w:t>
             </w:r>
           </w:p>
         </w:tc>
@@ -5121,7 +4978,7 @@
                 <w:sz w:val="19"/>
                 <w:szCs w:val="19"/>
               </w:rPr>
-              <w:t xml:space="preserve">Prototipo</w:t>
+              <w:t xml:space="preserve">Prototipo top-down</w:t>
             </w:r>
           </w:p>
         </w:tc>
@@ -5153,7 +5010,7 @@
                 <w:sz w:val="19"/>
                 <w:szCs w:val="19"/>
               </w:rPr>
-              <w:t xml:space="preserve">Registros</w:t>
+              <w:t xml:space="preserve">Instancias</w:t>
             </w:r>
           </w:p>
         </w:tc>
@@ -5876,7 +5733,7 @@
         <w:pStyle w:val="Heading3"/>
       </w:pPr>
       <w:r>
-        <w:t xml:space="preserve">Funcionamiento bajo estrés, ρ = 0.5</w:t>
+        <w:t xml:space="preserve">Régimen de estrés, ρ = 0.5</w:t>
       </w:r>
     </w:p>
     <w:tbl>
@@ -5928,7 +5785,7 @@
                 <w:sz w:val="19"/>
                 <w:szCs w:val="19"/>
               </w:rPr>
-              <w:t xml:space="preserve">Grupo (nodo F2)</w:t>
+              <w:t xml:space="preserve">Nodo F2</w:t>
             </w:r>
           </w:p>
         </w:tc>
@@ -5960,7 +5817,7 @@
                 <w:sz w:val="19"/>
                 <w:szCs w:val="19"/>
               </w:rPr>
-              <w:t xml:space="preserve">Prototipo</w:t>
+              <w:t xml:space="preserve">Prototipo top-down</w:t>
             </w:r>
           </w:p>
         </w:tc>
@@ -5992,7 +5849,7 @@
                 <w:sz w:val="19"/>
                 <w:szCs w:val="19"/>
               </w:rPr>
-              <w:t xml:space="preserve">Registros</w:t>
+              <w:t xml:space="preserve">Instancias</w:t>
             </w:r>
           </w:p>
         </w:tc>
@@ -6359,7 +6216,7 @@
         <w:pStyle w:val="Heading3"/>
       </w:pPr>
       <w:r>
-        <w:t xml:space="preserve">Funcionamiento bajo estrés, ρ = 0.3</w:t>
+        <w:t xml:space="preserve">Régimen de estrés, ρ = 0.3</w:t>
       </w:r>
     </w:p>
     <w:tbl>
@@ -6411,7 +6268,7 @@
                 <w:sz w:val="19"/>
                 <w:szCs w:val="19"/>
               </w:rPr>
-              <w:t xml:space="preserve">Grupo (nodo F2)</w:t>
+              <w:t xml:space="preserve">Nodo F2</w:t>
             </w:r>
           </w:p>
         </w:tc>
@@ -6443,7 +6300,7 @@
                 <w:sz w:val="19"/>
                 <w:szCs w:val="19"/>
               </w:rPr>
-              <w:t xml:space="preserve">Prototipo</w:t>
+              <w:t xml:space="preserve">Prototipo top-down</w:t>
             </w:r>
           </w:p>
         </w:tc>
@@ -6475,7 +6332,7 @@
                 <w:sz w:val="19"/>
                 <w:szCs w:val="19"/>
               </w:rPr>
-              <w:t xml:space="preserve">Registros</w:t>
+              <w:t xml:space="preserve">Instancias</w:t>
             </w:r>
           </w:p>
         </w:tc>
@@ -6664,7 +6521,7 @@
         <w:pStyle w:val="Heading2"/>
       </w:pPr>
       <w:r>
-        <w:t xml:space="preserve">6.2 Evolución de M</w:t>
+        <w:t xml:space="preserve">5.2 Evolución de M</w:t>
       </w:r>
     </w:p>
     <w:p>
@@ -6726,7 +6583,7 @@
           <w:sz w:val="18"/>
           <w:szCs w:val="18"/>
         </w:rPr>
-        <w:t xml:space="preserve">Figura 2. Cantidad de grupos acumulados a medida que se presentan los registros (ρ = 0.5).</w:t>
+        <w:t xml:space="preserve">Figura 2. Categorías acumuladas a medida que se presentan los patrones (ρ = 0.5).</w:t>
       </w:r>
     </w:p>
     <w:p>
@@ -6735,7 +6592,7 @@
         <w:jc w:val="both"/>
       </w:pPr>
       <w:r>
-        <w:t xml:space="preserve">En el dataset de estrés, los 4 grupos aparecen dentro de los primeros 27 registros y después la red ya no crea grupos nuevos. En el dataset normal se crean grupos hasta el registro 80, porque las combinaciones poco frecuentes (entre 1 % y 3 % de los registros) aparecen tarde y cada una abre un grupo propio.</w:t>
+        <w:t xml:space="preserve">En el régimen de estrés las 4 categorías aparecen en los primeros 27 patrones y la red queda estable el resto de la secuencia. En el régimen nominal se crean categorías nuevas hasta el patrón 80, porque las combinaciones raras (entre 1 % y 3 % de los registros) aparecen tarde y cada una abre un nodo propio.</w:t>
       </w:r>
     </w:p>
     <w:p>
@@ -6743,7 +6600,7 @@
         <w:pStyle w:val="Heading2"/>
       </w:pPr>
       <w:r>
-        <w:t xml:space="preserve">6.3 Efecto del orden de presentación</w:t>
+        <w:t xml:space="preserve">5.3 Efecto del orden de presentación</w:t>
       </w:r>
     </w:p>
     <w:p>
@@ -6752,7 +6609,7 @@
         <w:jc w:val="both"/>
       </w:pPr>
       <w:r>
-        <w:t xml:space="preserve">Se repitió la corrida 20 veces, cada una con los registros mezclados en un orden al azar distinto. La última columna indica en cuántas de esas 20 corridas se obtuvo una partición distinta, es decir, un reparto diferente de los registros entre los grupos:</w:t>
+        <w:t xml:space="preserve">Se repitió la corrida con 20 órdenes aleatorios de presentación. La última columna indica cuántas particiones distintas se obtuvieron, es decir, cuántos repartos diferentes de los registros entre los clústeres:</w:t>
       </w:r>
     </w:p>
     <w:tbl>
@@ -6869,7 +6726,7 @@
                 <w:sz w:val="19"/>
                 <w:szCs w:val="19"/>
               </w:rPr>
-              <w:t xml:space="preserve">M obtenido en los 20 órdenes</w:t>
+              <w:t xml:space="preserve">M observado en 20 órdenes</w:t>
             </w:r>
           </w:p>
         </w:tc>
@@ -7384,7 +7241,7 @@
         <w:pStyle w:val="Heading2"/>
       </w:pPr>
       <w:r>
-        <w:t xml:space="preserve">6.4 Funcionamiento normal y luego estrés</w:t>
+        <w:t xml:space="preserve">5.4 Régimen nominal y luego estrés</w:t>
       </w:r>
     </w:p>
     <w:p>
@@ -7393,7 +7250,7 @@
         <w:jc w:val="both"/>
       </w:pPr>
       <w:r>
-        <w:t xml:space="preserve">Se presentaron a la red los 100 registros del funcionamiento normal y, a continuación, los 100 de estrés. Esto simula una red que monitorea el servidor, aprende primero cómo funciona normalmente y luego recibe un período de carga.</w:t>
+        <w:t xml:space="preserve">Se presentaron a la red los 100 registros nominales seguidos de los 100 de estrés, como si la red monitoreara el servidor y, después de aprender la operación normal, llegara un período de carga.</w:t>
       </w:r>
     </w:p>
     <w:tbl>
@@ -7542,7 +7399,7 @@
                 <w:sz w:val="19"/>
                 <w:szCs w:val="19"/>
               </w:rPr>
-              <w:t xml:space="preserve">Registros de estrés en grupos del funcionamiento normal</w:t>
+              <w:t xml:space="preserve">Patrones de estrés absorbidos por categorías nominales</w:t>
             </w:r>
           </w:p>
         </w:tc>
@@ -8143,7 +8000,7 @@
         <w:pStyle w:val="Heading1"/>
       </w:pPr>
       <w:r>
-        <w:t xml:space="preserve">7. Evaluación de los resultados</w:t>
+        <w:t xml:space="preserve">6. Evaluación de los resultados</w:t>
       </w:r>
     </w:p>
     <w:p>
@@ -8151,7 +8008,7 @@
         <w:pStyle w:val="Heading2"/>
       </w:pPr>
       <w:r>
-        <w:t xml:space="preserve">7.1 Los estados descubiertos tienen sentido</w:t>
+        <w:t xml:space="preserve">6.1 Los estados descubiertos son coherentes</w:t>
       </w:r>
     </w:p>
     <w:p>
@@ -8160,7 +8017,7 @@
         <w:jc w:val="both"/>
       </w:pPr>
       <w:r>
-        <w:t xml:space="preserve">Con ρ = 0.5, los prototipos se pueden leer directamente como estados del servidor. En el funcionamiento normal la red separa las alertas aisladas de disco (23 %), de CPU (21 %) y de memoria (12 %), la combinación de CPU y disco (18 %) y un estado de tráfico de red alto en ambos sentidos (21 %). En el funcionamiento bajo estrés, el estado más frecuente es memoria y red altas (57 %), seguido de CPU, memoria y disco altos al mismo tiempo (19 %): son dos tipos de carga claramente distintos, uno asociado a la red y otro al procesamiento.</w:t>
+        <w:t xml:space="preserve">Con ρ = 0.5 los prototipos se interpretan directamente como estados del servidor. En el régimen nominal la red separa alertas aisladas de disco (23 %), de CPU (21 %) y de memoria (12 %), la combinación CPU + disco (18 %) y un estado de tráfico de red alto en ambos sentidos (21 %). En el régimen de estrés el estado dominante es memoria + red alta (57 %), seguido de CPU + memoria + disco (19 %): dos tipos de carga claramente distintos, uno ligado a la red y otro al procesamiento.</w:t>
       </w:r>
     </w:p>
     <w:p>
@@ -8168,7 +8025,7 @@
         <w:pStyle w:val="Heading2"/>
       </w:pPr>
       <w:r>
-        <w:t xml:space="preserve">7.2 Efecto de la vigilancia</w:t>
+        <w:t xml:space="preserve">6.2 Efecto de la vigilancia</w:t>
       </w:r>
     </w:p>
     <w:p>
@@ -8176,7 +8033,7 @@
         <w:pStyle w:val="ListParagraph"/>
         <w:numPr>
           <w:ilvl w:val="0"/>
-          <w:numId w:val="3"/>
+          <w:numId w:val="4"/>
         </w:numPr>
         <w:spacing w:after="60" w:line="276"/>
       </w:pPr>
@@ -8185,10 +8042,10 @@
           <w:b/>
           <w:bCs/>
         </w:rPr>
-        <w:t xml:space="preserve">Funcionamiento normal:</w:t>
-      </w:r>
-      <w:r>
-        <w:t xml:space="preserve"> M pasa de 4 a 8 entre ρ = 0.3 y ρ = 0.5 y después no cambia. La explicación es aritmética: los registros tienen 1 o 2 alertas, así que su parecido con el prototipo de otra combinación vale como máximo 1/2 = 0.5. Como el test exige superar ρ (no alcanza con igualarlo), con ρ ≥ 0.5 cada combinación queda en su propio grupo; con ρ &lt; 0.5, los registros de 2 alertas se unen a prototipos de 1 alerta.</w:t>
+        <w:t xml:space="preserve">Régimen nominal:</w:t>
+      </w:r>
+      <w:r>
+        <w:t xml:space="preserve"> M salta de 4 a 8 entre ρ = 0.3 y ρ = 0.5 y no cambia después. La explicación es aritmética: los registros tienen 1 o 2 alertas, así que la coincidencia con un prototipo distinto vale como máximo 1/2 = 0.5. Como el test es estricto (exige superar ρ, no alcanza con igualarlo), con ρ ≥ 0.5 cada combinación termina en su propia categoría; con ρ &lt; 0.5 los registros de 2 alertas se fusionan con prototipos de 1 alerta.</w:t>
       </w:r>
     </w:p>
     <w:p>
@@ -8196,7 +8053,7 @@
         <w:pStyle w:val="ListParagraph"/>
         <w:numPr>
           <w:ilvl w:val="0"/>
-          <w:numId w:val="3"/>
+          <w:numId w:val="4"/>
         </w:numPr>
         <w:spacing w:after="60" w:line="276"/>
       </w:pPr>
@@ -8205,10 +8062,10 @@
           <w:b/>
           <w:bCs/>
         </w:rPr>
-        <w:t xml:space="preserve">Funcionamiento bajo estrés:</w:t>
-      </w:r>
-      <w:r>
-        <w:t xml:space="preserve"> M crece de forma gradual (2, 4, 5 y 7). Con ρ ≤ 0.3 la red resume el período en dos grandes estados: procesamiento (CPU, memoria y disco) y red. Con ρ = 0.9 casi cada combinación tiene su propio grupo.</w:t>
+        <w:t xml:space="preserve">Régimen de estrés:</w:t>
+      </w:r>
+      <w:r>
+        <w:t xml:space="preserve"> M crece de forma gradual (2, 4, 5 y 7). Con ρ ≤ 0.3 la red resume el régimen en dos grandes estados: procesamiento (CPU + memoria + disco) y red. Con ρ = 0.9 casi cada combinación tiene su nodo.</w:t>
       </w:r>
     </w:p>
     <w:p>
@@ -8216,12 +8073,12 @@
         <w:pStyle w:val="ListParagraph"/>
         <w:numPr>
           <w:ilvl w:val="0"/>
-          <w:numId w:val="3"/>
+          <w:numId w:val="4"/>
         </w:numPr>
         <w:spacing w:after="60" w:line="276"/>
       </w:pPr>
       <w:r>
-        <w:t xml:space="preserve">Esto confirma lo que planteaba la propuesta: una vigilancia baja produce pocos grupos amplios y una alta, muchos grupos específicos.</w:t>
+        <w:t xml:space="preserve">Esto confirma lo que planteaba la propuesta: una vigilancia baja produce pocas categorías amplias y una alta, muchas categorías específicas.</w:t>
       </w:r>
     </w:p>
     <w:p>
@@ -8229,7 +8086,7 @@
         <w:pStyle w:val="Heading2"/>
       </w:pPr>
       <w:r>
-        <w:t xml:space="preserve">7.3 Efecto del AND: generalización y erosión</w:t>
+        <w:t xml:space="preserve">6.3 Efecto del AND: generalización y erosión</w:t>
       </w:r>
     </w:p>
     <w:p>
@@ -8238,7 +8095,7 @@
         <w:jc w:val="both"/>
       </w:pPr>
       <w:r>
-        <w:t xml:space="preserve">En el dataset de estrés con ρ = 0.5, el prototipo del grupo 01 es [0, 0, 0, 1, 1], una combinación que no aparece en el dataset (todos sus registros tienen 3 alertas o más). Es lo que tienen en común los registros de ese grupo: la red </w:t>
+        <w:t xml:space="preserve">En el régimen de estrés con ρ = 0.5, el prototipo del nodo 01 es [0, 0, 0, 1, 1], una combinación que no existe en el dataset (todos los registros tienen 3 o más alertas). Es la intersección de los patrones que absorbió: la red </w:t>
       </w:r>
       <w:r>
         <w:rPr>
@@ -8248,7 +8105,7 @@
         <w:t xml:space="preserve">generalizó</w:t>
       </w:r>
       <w:r>
-        <w:t xml:space="preserve">, es decir, se quedó con el rasgo compartido (tráfico de red alto) y descartó el resto. Este mismo mecanismo hace que la red sea sensible al ruido: un 1 que se pierde por un error de medición desaparece del prototipo y ya no se recupera, lo que se conoce como </w:t>
+        <w:t xml:space="preserve">, es decir, conservó la característica común (tráfico de red alto) y descartó lo demás. Este mismo mecanismo vuelve a la red sensible al ruido, porque un bit perdido nunca se recupera en el prototipo; a este efecto se lo llama </w:t>
       </w:r>
       <w:r>
         <w:rPr>
@@ -8258,7 +8115,7 @@
         <w:t xml:space="preserve">erosión</w:t>
       </w:r>
       <w:r>
-        <w:t xml:space="preserve"> del prototipo.</w:t>
+        <w:t xml:space="preserve">.</w:t>
       </w:r>
     </w:p>
     <w:p>
@@ -8266,7 +8123,7 @@
         <w:pStyle w:val="Heading2"/>
       </w:pPr>
       <w:r>
-        <w:t xml:space="preserve">7.4 Dependencia del orden</w:t>
+        <w:t xml:space="preserve">6.4 Dependencia del orden</w:t>
       </w:r>
     </w:p>
     <w:p>
@@ -8275,7 +8132,7 @@
         <w:jc w:val="both"/>
       </w:pPr>
       <w:r>
-        <w:t xml:space="preserve">Con ρ = 0.5, la cantidad de grupos fue la misma en los 20 órdenes al azar, pero el reparto de los registros entre los grupos cambió: en el dataset de estrés, los 20 órdenes dieron 20 particiones distintas. Con ρ = 0.3, en el dataset de estrés se obtuvieron 2 grupos en 12 órdenes y 3 grupos en los otros 8. Es la limitación esperable del algoritmo del líder, porque el primer registro de cada grupo condiciona su prototipo.</w:t>
+        <w:t xml:space="preserve">Con ρ = 0.5 la cantidad de categorías no cambió en 20 órdenes aleatorios, pero la distribución de los registros entre ellas sí: en el régimen de estrés, los 20 órdenes produjeron 20 particiones distintas. Con ρ = 0.3, en el régimen de estrés M fue 2 en 12 órdenes y 3 en los otros 8. Es la limitación esperable del algoritmo del líder: el primer patrón de cada clúster condiciona su prototipo.</w:t>
       </w:r>
     </w:p>
     <w:p>
@@ -8283,7 +8140,7 @@
         <w:pStyle w:val="Heading2"/>
       </w:pPr>
       <w:r>
-        <w:t xml:space="preserve">7.5 Detección del período de estrés</w:t>
+        <w:t xml:space="preserve">6.5 Detección del régimen nuevo</w:t>
       </w:r>
     </w:p>
     <w:p>
@@ -8291,7 +8148,7 @@
         <w:pStyle w:val="ListParagraph"/>
         <w:numPr>
           <w:ilvl w:val="0"/>
-          <w:numId w:val="3"/>
+          <w:numId w:val="4"/>
         </w:numPr>
         <w:spacing w:after="60" w:line="276"/>
       </w:pPr>
@@ -8306,7 +8163,7 @@
         <w:t xml:space="preserve">ρ ≥ 0.7</w:t>
       </w:r>
       <w:r>
-        <w:t xml:space="preserve">, ningún registro de estrés queda en un grupo aprendido durante el funcionamiento normal y la pureza es 1. La llegada del estrés se manifiesta como la creación de 5 grupos nuevos, que es exactamente la definición de anomalía de la sección 2.1.</w:t>
+        <w:t xml:space="preserve"> ningún patrón de estrés es absorbido por una categoría aprendida durante el régimen nominal y la pureza es 1. La llegada del régimen de estrés se manifiesta como la creación de 5 categorías nuevas, que es exactamente la definición operativa de anomalía (Manual de Referencia, sección 1.1).</w:t>
       </w:r>
     </w:p>
     <w:p>
@@ -8314,7 +8171,7 @@
         <w:pStyle w:val="ListParagraph"/>
         <w:numPr>
           <w:ilvl w:val="0"/>
-          <w:numId w:val="3"/>
+          <w:numId w:val="4"/>
         </w:numPr>
         <w:spacing w:after="60" w:line="276"/>
       </w:pPr>
@@ -8329,7 +8186,7 @@
         <w:t xml:space="preserve">ρ = 0.5</w:t>
       </w:r>
       <w:r>
-        <w:t xml:space="preserve">, 27 de los 100 registros de estrés quedan en grupos del funcionamiento normal. Por ejemplo, los 17 registros con CPU, memoria y disco altos quedan en el grupo normal de CPU y disco, porque coinciden en 2 de sus 3 alertas (2/3 = 0.67, que supera 0.5).</w:t>
+        <w:t xml:space="preserve"> se absorben 27 de 100 patrones de estrés. Por ejemplo, los 17 registros CPU + memoria + disco caen en la categoría nominal CPU + disco, porque coinciden en 2 de sus 3 alertas (2/3 = 0.67, que supera 0.5).</w:t>
       </w:r>
     </w:p>
     <w:p>
@@ -8337,7 +8194,7 @@
         <w:pStyle w:val="ListParagraph"/>
         <w:numPr>
           <w:ilvl w:val="0"/>
-          <w:numId w:val="3"/>
+          <w:numId w:val="4"/>
         </w:numPr>
         <w:spacing w:after="60" w:line="276"/>
       </w:pPr>
@@ -8352,7 +8209,7 @@
         <w:t xml:space="preserve">ρ ≤ 0.3</w:t>
       </w:r>
       <w:r>
-        <w:t xml:space="preserve">, quedan 96 de 100: la red ya no distingue el estrés del funcionamiento normal.</w:t>
+        <w:t xml:space="preserve"> se absorben 96 de 100: la red ya no distingue el estrés de la operación normal.</w:t>
       </w:r>
     </w:p>
     <w:p>
@@ -8368,7 +8225,7 @@
         <w:t xml:space="preserve">Conclusión práctica:</w:t>
       </w:r>
       <w:r>
-        <w:t xml:space="preserve"> para monitorear este servidor, ρ = 0.7 separa sin errores los dos períodos y forma 13 grupos en total. ρ = 0.5 sirve para describir cada período por separado, pero no alcanza para detectar el estrés.</w:t>
+        <w:t xml:space="preserve"> para monitorear este servidor, ρ = 0.7 separa sin errores los dos regímenes con 13 categorías. ρ = 0.5 sirve para resumir cada régimen por separado, pero no alcanza como detector.</w:t>
       </w:r>
     </w:p>
     <w:p>
@@ -8376,7 +8233,7 @@
         <w:pStyle w:val="Heading1"/>
       </w:pPr>
       <w:r>
-        <w:t xml:space="preserve">8. Cambios respecto de la propuesta de entrega parcial</w:t>
+        <w:t xml:space="preserve">7. Cambios respecto de la propuesta de entrega parcial</w:t>
       </w:r>
     </w:p>
     <w:tbl>
@@ -8581,7 +8438,7 @@
                 <w:sz w:val="19"/>
                 <w:szCs w:val="19"/>
               </w:rPr>
-              <w:t xml:space="preserve">El dataset disponible no registra hilos ni bloqueos, pero sí tráfico de red.</w:t>
+              <w:t xml:space="preserve">El dataset disponible no registra hilos ni bloqueos; sí registra tráfico de red.</w:t>
             </w:r>
           </w:p>
         </w:tc>
@@ -8641,7 +8498,7 @@
                 <w:sz w:val="19"/>
                 <w:szCs w:val="19"/>
               </w:rPr>
-              <w:t xml:space="preserve">Percentil 90 de cada medición</w:t>
+              <w:t xml:space="preserve">Percentil 90 de cada métrica</w:t>
             </w:r>
           </w:p>
         </w:tc>
@@ -8670,7 +8527,7 @@
                 <w:sz w:val="19"/>
                 <w:szCs w:val="19"/>
               </w:rPr>
-              <w:t xml:space="preserve">Con CPU &gt; 80 % no habría ninguna alerta de CPU (el máximo del período es 79 %) y la memoria nunca baja de 78 %. El percentil 90 se adapta a la escala de cada medición.</w:t>
+              <w:t xml:space="preserve">Con CPU &gt; 80 % no habría ninguna alerta de CPU (el máximo del período es 79 %) y la memoria nunca baja de 78 %. El P90 se adapta a la escala de cada métrica.</w:t>
             </w:r>
           </w:p>
         </w:tc>
@@ -8701,7 +8558,7 @@
                 <w:sz w:val="19"/>
                 <w:szCs w:val="19"/>
               </w:rPr>
-              <w:t xml:space="preserve">Completar valores faltantes con el último valor válido</w:t>
+              <w:t xml:space="preserve">Nulos rellenados con el último estado válido</w:t>
             </w:r>
           </w:p>
         </w:tc>
@@ -8759,7 +8616,7 @@
                 <w:sz w:val="19"/>
                 <w:szCs w:val="19"/>
               </w:rPr>
-              <w:t xml:space="preserve">La telemetría original no tiene valores faltantes. Sí se descartaron los registros sin alertas.</w:t>
+              <w:t xml:space="preserve">La telemetría cruda no tiene valores faltantes. Sí se descartaron los vectores sin alertas.</w:t>
             </w:r>
           </w:p>
         </w:tc>
@@ -8848,7 +8705,7 @@
                 <w:sz w:val="19"/>
                 <w:szCs w:val="19"/>
               </w:rPr>
-              <w:t xml:space="preserve">Supera el mínimo de la consigna y hace más estables las mediciones.</w:t>
+              <w:t xml:space="preserve">Supera el mínimo de la consigna y da más estabilidad a las métricas.</w:t>
             </w:r>
           </w:p>
         </w:tc>
@@ -8908,7 +8765,7 @@
                 <w:sz w:val="19"/>
                 <w:szCs w:val="19"/>
               </w:rPr>
-              <w:t xml:space="preserve">Pureza contra el dataset de origen (normal o estrés)</w:t>
+              <w:t xml:space="preserve">Pureza contra el régimen de origen (nominal o estrés)</w:t>
             </w:r>
           </w:p>
         </w:tc>
@@ -8937,7 +8794,7 @@
                 <w:sz w:val="19"/>
                 <w:szCs w:val="19"/>
               </w:rPr>
-              <w:t xml:space="preserve">No existen etiquetas reales de anomalía; el origen del registro es la mejor referencia disponible.</w:t>
+              <w:t xml:space="preserve">No existen etiquetas reales de anomalía; el régimen de origen es la mejor etiqueta disponible.</w:t>
             </w:r>
           </w:p>
         </w:tc>
@@ -8948,7 +8805,7 @@
         <w:pStyle w:val="Heading1"/>
       </w:pPr>
       <w:r>
-        <w:t xml:space="preserve">9. Limitaciones y trabajo futuro</w:t>
+        <w:t xml:space="preserve">8. Limitaciones y trabajo futuro</w:t>
       </w:r>
     </w:p>
     <w:p>
@@ -8956,12 +8813,12 @@
         <w:pStyle w:val="ListParagraph"/>
         <w:numPr>
           <w:ilvl w:val="0"/>
-          <w:numId w:val="3"/>
+          <w:numId w:val="4"/>
         </w:numPr>
         <w:spacing w:after="60" w:line="276"/>
       </w:pPr>
       <w:r>
-        <w:t xml:space="preserve">Al convertir las mediciones a 0 y 1 se pierde su intensidad: un uso de CPU de 54 % y uno de 79 % valen igual. Las variantes Fuzzy ART o ART-2 permitirían trabajar directamente con valores continuos.</w:t>
+        <w:t xml:space="preserve">La binarización por percentil 90 pierde la intensidad de las métricas: un uso de CPU de 54 % y uno de 79 % valen igual. Fuzzy ART o ART-2 permitirían trabajar con valores continuos.</w:t>
       </w:r>
     </w:p>
     <w:p>
@@ -8969,12 +8826,12 @@
         <w:pStyle w:val="ListParagraph"/>
         <w:numPr>
           <w:ilvl w:val="0"/>
-          <w:numId w:val="3"/>
+          <w:numId w:val="4"/>
         </w:numPr>
         <w:spacing w:after="60" w:line="276"/>
       </w:pPr>
       <w:r>
-        <w:t xml:space="preserve">El origen de cada registro (normal o estrés) se definió con la misma cantidad de alertas que ve la red. Por eso la pureza mide la coherencia del agrupamiento, no aciertos frente a incidentes reales del servidor.</w:t>
+        <w:t xml:space="preserve">La etiqueta de régimen se construye con la misma cantidad de alertas que ve la red, así que la pureza mide la consistencia del agrupamiento y no aciertos frente a incidentes reales.</w:t>
       </w:r>
     </w:p>
     <w:p>
@@ -8982,12 +8839,12 @@
         <w:pStyle w:val="ListParagraph"/>
         <w:numPr>
           <w:ilvl w:val="0"/>
-          <w:numId w:val="3"/>
+          <w:numId w:val="4"/>
         </w:numPr>
         <w:spacing w:after="60" w:line="276"/>
       </w:pPr>
       <w:r>
-        <w:t xml:space="preserve">Para reducir la dependencia del orden se podrían combinar los resultados de varios órdenes, o hacer que los pesos se adapten más lentamente, como sugiere Lippmann.</w:t>
+        <w:t xml:space="preserve">Para reducir la dependencia del orden se podría combinar el resultado de varios órdenes o adaptar los pesos más lentamente, como sugiere Lippmann.</w:t>
       </w:r>
     </w:p>
     <w:p>
@@ -8995,7 +8852,7 @@
         <w:pStyle w:val="Heading1"/>
       </w:pPr>
       <w:r>
-        <w:t xml:space="preserve">10. Conclusiones</w:t>
+        <w:t xml:space="preserve">9. Conclusiones</w:t>
       </w:r>
     </w:p>
     <w:p>
@@ -9004,7 +8861,7 @@
         <w:jc w:val="both"/>
       </w:pPr>
       <w:r>
-        <w:t xml:space="preserve">CarGross.py reproduce el algoritmo del Box 3 de Lippmann y su comportamiento en el ejemplo de las letras del artículo. Con los datos de telemetría, la red descubre sin supervisión estados de funcionamiento del servidor que se pueden interpretar, resume el período de estrés en pocos grupos gracias a la generalización del AND y, con una vigilancia de 0.7, reconoce ese período como completamente nuevo respecto del funcionamiento normal. Las limitaciones observadas, la dependencia del orden y la sensibilidad a la elección de ρ, coinciden con las que la bibliografía atribuye a este tipo de red.</w:t>
+        <w:t xml:space="preserve">CarGross.py reproduce el algoritmo del Box 3 de Lippmann y su comportamiento en el ejemplo de letras del artículo. Con los datos de telemetría, la red descubre sin supervisión estados operativos interpretables, resume el régimen de estrés en pocas categorías gracias a la generalización por AND y, con una vigilancia de 0.7, reconoce el régimen de estrés como completamente nuevo respecto de la operación normal. Las limitaciones observadas, la dependencia del orden y la sensibilidad a la elección de ρ, son las que la bibliografía atribuye a este tipo de red.</w:t>
       </w:r>
     </w:p>
     <w:p>
@@ -9386,17 +9243,17 @@
     </w:lvlOverride>
   </w:num>
   <w:num w:numId="3">
+    <w:abstractNumId w:val="3"/>
+    <w:lvlOverride w:ilvl="0">
+      <w:startOverride w:val="1"/>
+    </w:lvlOverride>
+  </w:num>
+  <w:num w:numId="4">
     <w:abstractNumId w:val="2"/>
     <w:lvlOverride w:ilvl="0">
       <w:startOverride w:val="1"/>
     </w:lvlOverride>
     <w:lvlOverride w:ilvl="1">
-      <w:startOverride w:val="1"/>
-    </w:lvlOverride>
-  </w:num>
-  <w:num w:numId="4">
-    <w:abstractNumId w:val="3"/>
-    <w:lvlOverride w:ilvl="0">
       <w:startOverride w:val="1"/>
     </w:lvlOverride>
   </w:num>

</xml_diff>

<commit_message>
Informe: se quita la sección de limitaciones y trabajo futuro; conclusión más breve con la aclaración sobre la pureza
Co-Authored-By: Claude Opus 5.5 <noreply@anthropic.com>
</commit_message>
<xml_diff>
--- a/docs/Informe_de_Corridas_CarGross.docx
+++ b/docs/Informe_de_Corridas_CarGross.docx
@@ -8805,54 +8805,7 @@
         <w:pStyle w:val="Heading1"/>
       </w:pPr>
       <w:r>
-        <w:t xml:space="preserve">8. Limitaciones y trabajo futuro</w:t>
-      </w:r>
-    </w:p>
-    <w:p>
-      <w:pPr>
-        <w:pStyle w:val="ListParagraph"/>
-        <w:numPr>
-          <w:ilvl w:val="0"/>
-          <w:numId w:val="4"/>
-        </w:numPr>
-        <w:spacing w:after="60" w:line="276"/>
-      </w:pPr>
-      <w:r>
-        <w:t xml:space="preserve">La binarización por percentil 90 pierde la intensidad de las métricas: un uso de CPU de 54 % y uno de 79 % valen igual. Fuzzy ART o ART-2 permitirían trabajar con valores continuos.</w:t>
-      </w:r>
-    </w:p>
-    <w:p>
-      <w:pPr>
-        <w:pStyle w:val="ListParagraph"/>
-        <w:numPr>
-          <w:ilvl w:val="0"/>
-          <w:numId w:val="4"/>
-        </w:numPr>
-        <w:spacing w:after="60" w:line="276"/>
-      </w:pPr>
-      <w:r>
-        <w:t xml:space="preserve">La etiqueta de régimen se construye con la misma cantidad de alertas que ve la red, así que la pureza mide la consistencia del agrupamiento y no aciertos frente a incidentes reales.</w:t>
-      </w:r>
-    </w:p>
-    <w:p>
-      <w:pPr>
-        <w:pStyle w:val="ListParagraph"/>
-        <w:numPr>
-          <w:ilvl w:val="0"/>
-          <w:numId w:val="4"/>
-        </w:numPr>
-        <w:spacing w:after="60" w:line="276"/>
-      </w:pPr>
-      <w:r>
-        <w:t xml:space="preserve">Para reducir la dependencia del orden se podría combinar el resultado de varios órdenes o adaptar los pesos más lentamente, como sugiere Lippmann.</w:t>
-      </w:r>
-    </w:p>
-    <w:p>
-      <w:pPr>
-        <w:pStyle w:val="Heading1"/>
-      </w:pPr>
-      <w:r>
-        <w:t xml:space="preserve">9. Conclusiones</w:t>
+        <w:t xml:space="preserve">8. Conclusiones</w:t>
       </w:r>
     </w:p>
     <w:p>
@@ -8861,7 +8814,7 @@
         <w:jc w:val="both"/>
       </w:pPr>
       <w:r>
-        <w:t xml:space="preserve">CarGross.py reproduce el algoritmo del Box 3 de Lippmann y su comportamiento en el ejemplo de letras del artículo. Con los datos de telemetría, la red descubre sin supervisión estados operativos interpretables, resume el régimen de estrés en pocas categorías gracias a la generalización por AND y, con una vigilancia de 0.7, reconoce el régimen de estrés como completamente nuevo respecto de la operación normal. Las limitaciones observadas, la dependencia del orden y la sensibilidad a la elección de ρ, son las que la bibliografía atribuye a este tipo de red.</w:t>
+        <w:t xml:space="preserve">CarGross.py implementa correctamente el algoritmo de Lippmann (1987). Con los datos del servidor, la red agrupó sin ayuda estados de funcionamiento que tienen sentido. Cuanto mayor es la vigilancia ρ, más detallado es el agrupamiento: con ρ ≥ 0.7, la red separó por completo los patrones de estrés de los del régimen nominal. Como los dos regímenes se definieron según la cantidad de alertas, esto muestra que el agrupamiento es coherente con ese criterio, pero no prueba que la red detecte fallas reales. Como señala Lippmann, la red depende del orden de los datos y es sensible al ruido.</w:t>
       </w:r>
     </w:p>
     <w:p>

</xml_diff>